<commit_message>
Refonte de la mise en page du CV général dans le style de l'original
Police serif, colonne gauche dates/rubriques, filets fins, photo en en-tête,
une page, structure toujours lisible par les ATS.

Co-Authored-By: Claude Opus 5.5 <noreply@anthropic.com>
Claude-Session: https://claude.ai/code/session_01Uwm2tAGtUGTnWWMUSVQkub
</commit_message>
<xml_diff>
--- a/output/CV_NicolasQiGUO_General.docx
+++ b/output/CV_NicolasQiGUO_General.docx
@@ -4,7 +4,9 @@
   <w:body>
     <w:p>
       <w:pPr>
-        <w:spacing w:before="0" w:after="40" w:line="240" w:lineRule="auto"/>
+        <w:keepNext w:val="0"/>
+        <w:spacing w:before="0" w:after="120" w:line="240" w:lineRule="auto"/>
+        <w:ind w:left="680"/>
       </w:pPr>
       <w:r>
         <w:drawing>
@@ -14,9 +16,9 @@
               <wp:align>right</wp:align>
             </wp:positionH>
             <wp:positionV relativeFrom="paragraph">
-              <wp:posOffset>0</wp:posOffset>
+              <wp:posOffset>18000</wp:posOffset>
             </wp:positionV>
-            <wp:extent cx="1044000" cy="1177400"/>
+            <wp:extent cx="1260000" cy="835882"/>
             <wp:effectExtent l="0" t="0" r="0" b="0"/>
             <wp:wrapSquare wrapText="bothSides"/>
             <wp:docPr id="1" name="Picture 1"/>
@@ -39,7 +41,7 @@
                   <pic:spPr>
                     <a:xfrm>
                       <a:off x="0" y="0"/>
-                      <a:ext cx="1044000" cy="1177400"/>
+                      <a:ext cx="1260000" cy="835882"/>
                     </a:xfrm>
                     <a:prstGeom prst="rect"/>
                   </pic:spPr>
@@ -51,97 +53,138 @@
       </w:r>
       <w:r>
         <w:rPr>
-          <w:rFonts w:ascii="Arial" w:hAnsi="Arial" w:eastAsia="Arial"/>
+          <w:rFonts w:ascii="Times New Roman" w:hAnsi="Times New Roman" w:eastAsia="Times New Roman"/>
           <w:b/>
           <w:i w:val="0"/>
-          <w:color w:val="1F3A5F"/>
-          <w:sz w:val="36"/>
+          <w:color w:val="000000"/>
+          <w:sz w:val="30"/>
+          <w:u w:val="single"/>
         </w:rPr>
         <w:t>NICOLAS QI GUO</w:t>
       </w:r>
     </w:p>
     <w:p>
       <w:pPr>
+        <w:keepNext w:val="0"/>
         <w:spacing w:before="0" w:after="80" w:line="240" w:lineRule="auto"/>
+        <w:ind w:left="680"/>
       </w:pPr>
       <w:r>
         <w:rPr>
-          <w:rFonts w:ascii="Arial" w:hAnsi="Arial" w:eastAsia="Arial"/>
+          <w:rFonts w:ascii="Times New Roman" w:hAnsi="Times New Roman" w:eastAsia="Times New Roman"/>
           <w:b/>
           <w:i w:val="0"/>
-          <w:sz w:val="22"/>
+          <w:color w:val="000000"/>
+          <w:sz w:val="19"/>
+          <w:u w:val="none"/>
         </w:rPr>
         <w:t>CHEF DE PROJET SI | TRANSFORMATION DIGITALE, IA &amp; AUTOMATISATION</w:t>
       </w:r>
     </w:p>
     <w:p>
       <w:pPr>
+        <w:keepNext w:val="0"/>
         <w:spacing w:before="0" w:after="0" w:line="240" w:lineRule="auto"/>
+        <w:ind w:left="680"/>
       </w:pPr>
       <w:r>
         <w:rPr>
-          <w:rFonts w:ascii="Arial" w:hAnsi="Arial" w:eastAsia="Arial"/>
+          <w:rFonts w:ascii="Times New Roman" w:hAnsi="Times New Roman" w:eastAsia="Times New Roman"/>
           <w:b w:val="0"/>
           <w:i w:val="0"/>
-          <w:color w:val="555555"/>
+          <w:color w:val="000000"/>
           <w:sz w:val="19"/>
+          <w:u w:val="none"/>
         </w:rPr>
         <w:t>Orléans, France | Mobilité Île-de-France</w:t>
       </w:r>
     </w:p>
     <w:p>
       <w:pPr>
+        <w:keepNext w:val="0"/>
         <w:spacing w:before="0" w:after="0" w:line="240" w:lineRule="auto"/>
+        <w:ind w:left="680"/>
       </w:pPr>
       <w:r>
         <w:rPr>
-          <w:rFonts w:ascii="Arial" w:hAnsi="Arial" w:eastAsia="Arial"/>
+          <w:rFonts w:ascii="Times New Roman" w:hAnsi="Times New Roman" w:eastAsia="Times New Roman"/>
           <w:b w:val="0"/>
           <w:i w:val="0"/>
-          <w:color w:val="555555"/>
+          <w:color w:val="000000"/>
           <w:sz w:val="19"/>
+          <w:u w:val="none"/>
         </w:rPr>
         <w:t>Tél. : +33 6 30 23 24 41 | E-mail : qi.guo@essec.edu</w:t>
       </w:r>
     </w:p>
     <w:p>
       <w:pPr>
-        <w:spacing w:before="120" w:after="0" w:line="264" w:lineRule="auto"/>
+        <w:keepNext w:val="0"/>
+        <w:spacing w:before="120" w:after="0" w:line="240" w:lineRule="auto"/>
+        <w:ind w:left="680"/>
       </w:pPr>
       <w:r>
         <w:rPr>
-          <w:rFonts w:ascii="Arial" w:hAnsi="Arial" w:eastAsia="Arial"/>
+          <w:rFonts w:ascii="Times New Roman" w:hAnsi="Times New Roman" w:eastAsia="Times New Roman"/>
           <w:b/>
           <w:i w:val="0"/>
-          <w:color w:val="1F3A5F"/>
+          <w:color w:val="000000"/>
           <w:sz w:val="19"/>
+          <w:u w:val="none"/>
         </w:rPr>
-        <w:t xml:space="preserve">Profil : </w:t>
-      </w:r>
-      <w:r>
-        <w:rPr>
-          <w:rFonts w:ascii="Arial" w:hAnsi="Arial" w:eastAsia="Arial"/>
-          <w:b w:val="0"/>
-          <w:i w:val="0"/>
-          <w:sz w:val="19"/>
-        </w:rPr>
-        <w:t>Chef de projet SI, major de promotion ESSEC &amp; Télécom Paris et Université Paris Cité, avec 3 ans d'expérience en transformation digitale chez BNP Paribas et La Poste Groupe. Pilotage de projets IA (GenAI, RAG, Copilot) et d'automatisation (RPA, Power Platform), du recueil des besoins à la mise en production, gouvernance projet et conduite du changement.</w:t>
+        <w:t>PROFIL</w:t>
       </w:r>
     </w:p>
     <w:p>
       <w:pPr>
-        <w:spacing w:before="140" w:after="60" w:line="240" w:lineRule="auto"/>
+        <w:keepNext w:val="0"/>
+        <w:spacing w:before="0" w:after="0" w:line="240" w:lineRule="auto"/>
+        <w:ind w:left="680"/>
+      </w:pPr>
+      <w:r>
+        <w:rPr>
+          <w:rFonts w:ascii="Times New Roman" w:hAnsi="Times New Roman" w:eastAsia="Times New Roman"/>
+          <w:b w:val="0"/>
+          <w:i w:val="0"/>
+          <w:color w:val="000000"/>
+          <w:sz w:val="19"/>
+          <w:u w:val="none"/>
+        </w:rPr>
+        <w:t>Chef de projet SI, 3 ans d'expérience en transformation digitale chez BNP Paribas et La Poste Groupe. Pilotage de projets IA (GenAI, RAG, Copilot) et d'automatisation (RPA, Power Platform), du recueil des besoins à la mise en production, gouvernance projet et conduite du changement.</w:t>
+      </w:r>
+    </w:p>
+    <w:p>
+      <w:pPr>
+        <w:keepNext w:val="0"/>
+        <w:spacing w:before="100" w:after="100" w:line="24" w:lineRule="auto"/>
         <w:pBdr>
-          <w:bottom w:val="single" w:sz="6" w:space="1" w:color="1F3A5F"/>
+          <w:bottom w:val="single" w:sz="4" w:space="1" w:color="A6A6A6"/>
         </w:pBdr>
       </w:pPr>
       <w:r>
         <w:rPr>
-          <w:rFonts w:ascii="Arial" w:hAnsi="Arial" w:eastAsia="Arial"/>
-          <w:b/>
+          <w:rFonts w:ascii="Times New Roman" w:hAnsi="Times New Roman" w:eastAsia="Times New Roman"/>
+          <w:b w:val="0"/>
           <w:i w:val="0"/>
-          <w:color w:val="1F3A5F"/>
-          <w:sz w:val="21"/>
+          <w:color w:val="000000"/>
+          <w:sz w:val="4"/>
+          <w:u w:val="none"/>
+        </w:rPr>
+      </w:r>
+    </w:p>
+    <w:p>
+      <w:pPr>
+        <w:keepNext/>
+        <w:spacing w:before="0" w:after="100" w:line="240" w:lineRule="auto"/>
+      </w:pPr>
+      <w:r>
+        <w:rPr>
+          <w:rFonts w:ascii="Times New Roman" w:hAnsi="Times New Roman" w:eastAsia="Times New Roman"/>
+          <w:b w:val="0"/>
+          <w:i w:val="0"/>
+          <w:color w:val="000000"/>
+          <w:sz w:val="19"/>
+          <w:u w:val="none"/>
         </w:rPr>
         <w:t>EXPÉRIENCES PROFESSIONNELLES</w:t>
       </w:r>
@@ -149,147 +192,221 @@
     <w:p>
       <w:pPr>
         <w:keepNext/>
-        <w:spacing w:before="20" w:after="0" w:line="240" w:lineRule="auto"/>
+        <w:tabs>
+          <w:tab w:pos="822" w:val="center"/>
+          <w:tab w:pos="1814" w:val="left"/>
+        </w:tabs>
+        <w:spacing w:before="0" w:after="0" w:line="240" w:lineRule="auto"/>
+        <w:ind w:left="1814" w:hanging="1814"/>
       </w:pPr>
       <w:r>
         <w:rPr>
-          <w:rFonts w:ascii="Arial" w:hAnsi="Arial" w:eastAsia="Arial"/>
-          <w:b/>
+          <w:rFonts w:ascii="Times New Roman" w:hAnsi="Times New Roman" w:eastAsia="Times New Roman"/>
+          <w:b w:val="0"/>
           <w:i w:val="0"/>
-          <w:color w:val="1F3A5F"/>
+          <w:color w:val="000000"/>
           <w:sz w:val="19"/>
+          <w:u w:val="none"/>
         </w:rPr>
-        <w:t xml:space="preserve">2024 – 2025 | </w:t>
+        <w:tab/>
+        <w:t>2024 – 2025</w:t>
+        <w:tab/>
       </w:r>
       <w:r>
         <w:rPr>
-          <w:rFonts w:ascii="Arial" w:hAnsi="Arial" w:eastAsia="Arial"/>
+          <w:rFonts w:ascii="Times New Roman" w:hAnsi="Times New Roman" w:eastAsia="Times New Roman"/>
           <w:b/>
           <w:i w:val="0"/>
+          <w:color w:val="000000"/>
           <w:sz w:val="19"/>
+          <w:u w:val="none"/>
         </w:rPr>
         <w:t>Digital Transformation Project Manager – AIR TECH @ BNP PARIBAS</w:t>
-      </w:r>
-      <w:r>
-        <w:rPr>
-          <w:rFonts w:ascii="Arial" w:hAnsi="Arial" w:eastAsia="Arial"/>
-          <w:b w:val="0"/>
-          <w:i w:val="0"/>
-          <w:sz w:val="19"/>
-        </w:rPr>
-        <w:t xml:space="preserve"> (Alternance)</w:t>
       </w:r>
     </w:p>
     <w:p>
       <w:pPr>
+        <w:keepNext/>
+        <w:tabs>
+          <w:tab w:pos="822" w:val="center"/>
+          <w:tab w:pos="1814" w:val="left"/>
+        </w:tabs>
         <w:spacing w:before="0" w:after="40" w:line="240" w:lineRule="auto"/>
+        <w:ind w:left="1814" w:hanging="1814"/>
       </w:pPr>
       <w:r>
         <w:rPr>
-          <w:rFonts w:ascii="Arial" w:hAnsi="Arial" w:eastAsia="Arial"/>
+          <w:rFonts w:ascii="Times New Roman" w:hAnsi="Times New Roman" w:eastAsia="Times New Roman"/>
+          <w:b w:val="0"/>
+          <w:i w:val="0"/>
+          <w:color w:val="000000"/>
+          <w:sz w:val="19"/>
+          <w:u w:val="none"/>
+        </w:rPr>
+        <w:tab/>
+      </w:r>
+      <w:r>
+        <w:rPr>
+          <w:rFonts w:ascii="Times New Roman" w:hAnsi="Times New Roman" w:eastAsia="Times New Roman"/>
           <w:b w:val="0"/>
           <w:i/>
-          <w:color w:val="555555"/>
+          <w:color w:val="000000"/>
+          <w:sz w:val="17"/>
+          <w:u w:val="none"/>
+        </w:rPr>
+        <w:t>Alternance</w:t>
+      </w:r>
+      <w:r>
+        <w:rPr>
+          <w:rFonts w:ascii="Times New Roman" w:hAnsi="Times New Roman" w:eastAsia="Times New Roman"/>
+          <w:b w:val="0"/>
+          <w:i w:val="0"/>
+          <w:color w:val="000000"/>
+          <w:sz w:val="19"/>
+          <w:u w:val="none"/>
+        </w:rPr>
+        <w:tab/>
+      </w:r>
+      <w:r>
+        <w:rPr>
+          <w:rFonts w:ascii="Times New Roman" w:hAnsi="Times New Roman" w:eastAsia="Times New Roman"/>
+          <w:b w:val="0"/>
+          <w:i/>
+          <w:color w:val="000000"/>
           <w:sz w:val="18"/>
+          <w:u w:val="none"/>
         </w:rPr>
         <w:t>Périmètre : Compliance &amp; Risk (AML, sanctions, contrôle et monitoring, sécurité financière)</w:t>
       </w:r>
     </w:p>
     <w:p>
       <w:pPr>
-        <w:spacing w:before="0" w:after="20" w:line="252" w:lineRule="auto"/>
-        <w:ind w:left="283" w:hanging="198"/>
+        <w:keepNext w:val="0"/>
+        <w:tabs>
+          <w:tab w:pos="2069" w:val="left"/>
+        </w:tabs>
+        <w:spacing w:before="0" w:after="40" w:line="240" w:lineRule="auto"/>
+        <w:ind w:left="2069" w:hanging="227"/>
       </w:pPr>
       <w:r>
         <w:rPr>
-          <w:rFonts w:ascii="Arial" w:hAnsi="Arial" w:eastAsia="Arial"/>
+          <w:rFonts w:ascii="Times New Roman" w:hAnsi="Times New Roman" w:eastAsia="Times New Roman"/>
           <w:b w:val="0"/>
           <w:i w:val="0"/>
+          <w:color w:val="000000"/>
           <w:sz w:val="19"/>
+          <w:u w:val="none"/>
         </w:rPr>
-        <w:t xml:space="preserve">•  </w:t>
+        <w:t>•</w:t>
+        <w:tab/>
       </w:r>
       <w:r>
         <w:rPr>
-          <w:rFonts w:ascii="Arial" w:hAnsi="Arial" w:eastAsia="Arial"/>
+          <w:rFonts w:ascii="Times New Roman" w:hAnsi="Times New Roman" w:eastAsia="Times New Roman"/>
           <w:b/>
           <w:i w:val="0"/>
+          <w:color w:val="000000"/>
           <w:sz w:val="19"/>
+          <w:u w:val="none"/>
         </w:rPr>
         <w:t xml:space="preserve">Structuration et coordination des initiatives IA &amp; RPA : </w:t>
       </w:r>
       <w:r>
         <w:rPr>
-          <w:rFonts w:ascii="Arial" w:hAnsi="Arial" w:eastAsia="Arial"/>
+          <w:rFonts w:ascii="Times New Roman" w:hAnsi="Times New Roman" w:eastAsia="Times New Roman"/>
           <w:b w:val="0"/>
           <w:i w:val="0"/>
+          <w:color w:val="000000"/>
           <w:sz w:val="19"/>
+          <w:u w:val="none"/>
         </w:rPr>
         <w:t>co-construction d'un dispositif de qualification et de priorisation des use cases (valeur business, ROI, faisabilité technique) ; 20+ use cases identifiés, dont 3 retenus pour un lancement en projet</w:t>
       </w:r>
     </w:p>
     <w:p>
       <w:pPr>
-        <w:spacing w:before="0" w:after="20" w:line="252" w:lineRule="auto"/>
-        <w:ind w:left="283" w:hanging="198"/>
+        <w:keepNext w:val="0"/>
+        <w:tabs>
+          <w:tab w:pos="2069" w:val="left"/>
+        </w:tabs>
+        <w:spacing w:before="0" w:after="40" w:line="240" w:lineRule="auto"/>
+        <w:ind w:left="2069" w:hanging="227"/>
       </w:pPr>
       <w:r>
         <w:rPr>
-          <w:rFonts w:ascii="Arial" w:hAnsi="Arial" w:eastAsia="Arial"/>
+          <w:rFonts w:ascii="Times New Roman" w:hAnsi="Times New Roman" w:eastAsia="Times New Roman"/>
           <w:b w:val="0"/>
           <w:i w:val="0"/>
+          <w:color w:val="000000"/>
           <w:sz w:val="19"/>
+          <w:u w:val="none"/>
         </w:rPr>
-        <w:t xml:space="preserve">•  </w:t>
+        <w:t>•</w:t>
+        <w:tab/>
       </w:r>
       <w:r>
         <w:rPr>
-          <w:rFonts w:ascii="Arial" w:hAnsi="Arial" w:eastAsia="Arial"/>
+          <w:rFonts w:ascii="Times New Roman" w:hAnsi="Times New Roman" w:eastAsia="Times New Roman"/>
           <w:b/>
           <w:i w:val="0"/>
+          <w:color w:val="000000"/>
           <w:sz w:val="19"/>
+          <w:u w:val="none"/>
         </w:rPr>
         <w:t xml:space="preserve">Pilotage et gouvernance des projets IA : </w:t>
       </w:r>
       <w:r>
         <w:rPr>
-          <w:rFonts w:ascii="Arial" w:hAnsi="Arial" w:eastAsia="Arial"/>
+          <w:rFonts w:ascii="Times New Roman" w:hAnsi="Times New Roman" w:eastAsia="Times New Roman"/>
           <w:b w:val="0"/>
           <w:i w:val="0"/>
+          <w:color w:val="000000"/>
           <w:sz w:val="19"/>
+          <w:u w:val="none"/>
         </w:rPr>
         <w:t>recueil et formalisation des besoins, coordination transverse métiers / IT, conduite de POC, coordination et suivi de l'industrialisation de 3 solutions IA (GenAI, RAG, Copilot), reporting auprès des instances de gouvernance</w:t>
       </w:r>
     </w:p>
     <w:p>
       <w:pPr>
-        <w:spacing w:before="0" w:after="20" w:line="252" w:lineRule="auto"/>
-        <w:ind w:left="283" w:hanging="198"/>
+        <w:keepNext w:val="0"/>
+        <w:tabs>
+          <w:tab w:pos="2069" w:val="left"/>
+        </w:tabs>
+        <w:spacing w:before="0" w:after="40" w:line="240" w:lineRule="auto"/>
+        <w:ind w:left="2069" w:hanging="227"/>
       </w:pPr>
       <w:r>
         <w:rPr>
-          <w:rFonts w:ascii="Arial" w:hAnsi="Arial" w:eastAsia="Arial"/>
+          <w:rFonts w:ascii="Times New Roman" w:hAnsi="Times New Roman" w:eastAsia="Times New Roman"/>
           <w:b w:val="0"/>
           <w:i w:val="0"/>
+          <w:color w:val="000000"/>
           <w:sz w:val="19"/>
+          <w:u w:val="none"/>
         </w:rPr>
-        <w:t xml:space="preserve">•  </w:t>
+        <w:t>•</w:t>
+        <w:tab/>
       </w:r>
       <w:r>
         <w:rPr>
-          <w:rFonts w:ascii="Arial" w:hAnsi="Arial" w:eastAsia="Arial"/>
+          <w:rFonts w:ascii="Times New Roman" w:hAnsi="Times New Roman" w:eastAsia="Times New Roman"/>
           <w:b/>
           <w:i w:val="0"/>
+          <w:color w:val="000000"/>
           <w:sz w:val="19"/>
+          <w:u w:val="none"/>
         </w:rPr>
         <w:t xml:space="preserve">Transformation digitale et conduite du changement : </w:t>
       </w:r>
       <w:r>
         <w:rPr>
-          <w:rFonts w:ascii="Arial" w:hAnsi="Arial" w:eastAsia="Arial"/>
+          <w:rFonts w:ascii="Times New Roman" w:hAnsi="Times New Roman" w:eastAsia="Times New Roman"/>
           <w:b w:val="0"/>
           <w:i w:val="0"/>
+          <w:color w:val="000000"/>
           <w:sz w:val="19"/>
+          <w:u w:val="none"/>
         </w:rPr>
         <w:t>contribution au déploiement d'un programme IA à grande échelle (5 000+ collaborateurs), animation d'un réseau de 70+ ambassadeurs IA, sessions d'onboarding et d'acculturation, événements communautaires</w:t>
       </w:r>
@@ -297,288 +414,419 @@
     <w:p>
       <w:pPr>
         <w:keepNext/>
-        <w:spacing w:before="100" w:after="0" w:line="240" w:lineRule="auto"/>
+        <w:tabs>
+          <w:tab w:pos="822" w:val="center"/>
+          <w:tab w:pos="1814" w:val="left"/>
+        </w:tabs>
+        <w:spacing w:before="120" w:after="0" w:line="240" w:lineRule="auto"/>
+        <w:ind w:left="1814" w:hanging="1814"/>
       </w:pPr>
       <w:r>
         <w:rPr>
-          <w:rFonts w:ascii="Arial" w:hAnsi="Arial" w:eastAsia="Arial"/>
-          <w:b/>
+          <w:rFonts w:ascii="Times New Roman" w:hAnsi="Times New Roman" w:eastAsia="Times New Roman"/>
+          <w:b w:val="0"/>
           <w:i w:val="0"/>
-          <w:color w:val="1F3A5F"/>
+          <w:color w:val="000000"/>
           <w:sz w:val="19"/>
+          <w:u w:val="none"/>
         </w:rPr>
-        <w:t xml:space="preserve">2022 – 2024 | </w:t>
+        <w:tab/>
+        <w:t>2022 – 2024</w:t>
+        <w:tab/>
       </w:r>
       <w:r>
         <w:rPr>
-          <w:rFonts w:ascii="Arial" w:hAnsi="Arial" w:eastAsia="Arial"/>
+          <w:rFonts w:ascii="Times New Roman" w:hAnsi="Times New Roman" w:eastAsia="Times New Roman"/>
           <w:b/>
           <w:i w:val="0"/>
+          <w:color w:val="000000"/>
           <w:sz w:val="19"/>
+          <w:u w:val="none"/>
         </w:rPr>
         <w:t>Chef de Projet SI – Data Intelligence &amp; Innovation DTSFG @ LA POSTE GROUPE</w:t>
-      </w:r>
-      <w:r>
-        <w:rPr>
-          <w:rFonts w:ascii="Arial" w:hAnsi="Arial" w:eastAsia="Arial"/>
-          <w:b w:val="0"/>
-          <w:i w:val="0"/>
-          <w:sz w:val="19"/>
-        </w:rPr>
-        <w:t xml:space="preserve"> (Alternance + CDD)</w:t>
       </w:r>
     </w:p>
     <w:p>
       <w:pPr>
+        <w:keepNext/>
+        <w:tabs>
+          <w:tab w:pos="822" w:val="center"/>
+          <w:tab w:pos="1814" w:val="left"/>
+        </w:tabs>
         <w:spacing w:before="0" w:after="40" w:line="240" w:lineRule="auto"/>
+        <w:ind w:left="1814" w:hanging="1814"/>
       </w:pPr>
       <w:r>
         <w:rPr>
-          <w:rFonts w:ascii="Arial" w:hAnsi="Arial" w:eastAsia="Arial"/>
+          <w:rFonts w:ascii="Times New Roman" w:hAnsi="Times New Roman" w:eastAsia="Times New Roman"/>
+          <w:b w:val="0"/>
+          <w:i w:val="0"/>
+          <w:color w:val="000000"/>
+          <w:sz w:val="19"/>
+          <w:u w:val="none"/>
+        </w:rPr>
+        <w:tab/>
+      </w:r>
+      <w:r>
+        <w:rPr>
+          <w:rFonts w:ascii="Times New Roman" w:hAnsi="Times New Roman" w:eastAsia="Times New Roman"/>
           <w:b w:val="0"/>
           <w:i/>
-          <w:color w:val="555555"/>
+          <w:color w:val="000000"/>
+          <w:sz w:val="17"/>
+          <w:u w:val="none"/>
+        </w:rPr>
+        <w:t>Alternance + CDD</w:t>
+      </w:r>
+      <w:r>
+        <w:rPr>
+          <w:rFonts w:ascii="Times New Roman" w:hAnsi="Times New Roman" w:eastAsia="Times New Roman"/>
+          <w:b w:val="0"/>
+          <w:i w:val="0"/>
+          <w:color w:val="000000"/>
+          <w:sz w:val="19"/>
+          <w:u w:val="none"/>
+        </w:rPr>
+        <w:tab/>
+      </w:r>
+      <w:r>
+        <w:rPr>
+          <w:rFonts w:ascii="Times New Roman" w:hAnsi="Times New Roman" w:eastAsia="Times New Roman"/>
+          <w:b w:val="0"/>
+          <w:i/>
+          <w:color w:val="000000"/>
           <w:sz w:val="18"/>
+          <w:u w:val="none"/>
         </w:rPr>
         <w:t>Périmètre : Direction de la Transformation des Solutions Finance (SI Finance, SIRH, SAP)</w:t>
       </w:r>
     </w:p>
     <w:p>
       <w:pPr>
-        <w:spacing w:before="0" w:after="20" w:line="252" w:lineRule="auto"/>
-        <w:ind w:left="283" w:hanging="198"/>
+        <w:keepNext w:val="0"/>
+        <w:tabs>
+          <w:tab w:pos="2069" w:val="left"/>
+        </w:tabs>
+        <w:spacing w:before="0" w:after="20" w:line="240" w:lineRule="auto"/>
+        <w:ind w:left="2069" w:hanging="227"/>
       </w:pPr>
       <w:r>
         <w:rPr>
-          <w:rFonts w:ascii="Arial" w:hAnsi="Arial" w:eastAsia="Arial"/>
+          <w:rFonts w:ascii="Times New Roman" w:hAnsi="Times New Roman" w:eastAsia="Times New Roman"/>
           <w:b w:val="0"/>
           <w:i w:val="0"/>
+          <w:color w:val="000000"/>
           <w:sz w:val="19"/>
+          <w:u w:val="none"/>
         </w:rPr>
-        <w:t xml:space="preserve">•  </w:t>
+        <w:t>•</w:t>
+        <w:tab/>
       </w:r>
       <w:r>
         <w:rPr>
-          <w:rFonts w:ascii="Arial" w:hAnsi="Arial" w:eastAsia="Arial"/>
+          <w:rFonts w:ascii="Times New Roman" w:hAnsi="Times New Roman" w:eastAsia="Times New Roman"/>
           <w:b/>
           <w:i w:val="0"/>
+          <w:color w:val="000000"/>
           <w:sz w:val="19"/>
+          <w:u w:val="none"/>
         </w:rPr>
         <w:t>Pilotage de projets d'automatisation (RPA &amp; Power Platform), dont 2 de bout en bout :</w:t>
       </w:r>
     </w:p>
     <w:p>
       <w:pPr>
-        <w:spacing w:before="0" w:after="20" w:line="252" w:lineRule="auto"/>
-        <w:ind w:left="567" w:hanging="198"/>
+        <w:keepNext w:val="0"/>
+        <w:tabs>
+          <w:tab w:pos="2381" w:val="left"/>
+        </w:tabs>
+        <w:spacing w:before="0" w:after="0" w:line="240" w:lineRule="auto"/>
+        <w:ind w:left="2381" w:hanging="227"/>
       </w:pPr>
       <w:r>
         <w:rPr>
-          <w:rFonts w:ascii="Arial" w:hAnsi="Arial" w:eastAsia="Arial"/>
+          <w:rFonts w:ascii="Times New Roman" w:hAnsi="Times New Roman" w:eastAsia="Times New Roman"/>
           <w:b w:val="0"/>
           <w:i w:val="0"/>
-          <w:sz w:val="19"/>
+          <w:color w:val="000000"/>
+          <w:sz w:val="15"/>
+          <w:u w:val="none"/>
         </w:rPr>
-        <w:t xml:space="preserve">–  </w:t>
+        <w:t>▪</w:t>
+        <w:tab/>
       </w:r>
       <w:r>
         <w:rPr>
-          <w:rFonts w:ascii="Arial" w:hAnsi="Arial" w:eastAsia="Arial"/>
+          <w:rFonts w:ascii="Times New Roman" w:hAnsi="Times New Roman" w:eastAsia="Times New Roman"/>
           <w:b w:val="0"/>
           <w:i w:val="0"/>
+          <w:color w:val="000000"/>
           <w:sz w:val="19"/>
+          <w:u w:val="none"/>
         </w:rPr>
         <w:t>Recueil et analyse des besoins métiers, rédaction des cahiers des charges et spécifications fonctionnelles</w:t>
       </w:r>
     </w:p>
     <w:p>
       <w:pPr>
-        <w:spacing w:before="0" w:after="20" w:line="252" w:lineRule="auto"/>
-        <w:ind w:left="567" w:hanging="198"/>
+        <w:keepNext w:val="0"/>
+        <w:tabs>
+          <w:tab w:pos="2381" w:val="left"/>
+        </w:tabs>
+        <w:spacing w:before="0" w:after="0" w:line="240" w:lineRule="auto"/>
+        <w:ind w:left="2381" w:hanging="227"/>
       </w:pPr>
       <w:r>
         <w:rPr>
-          <w:rFonts w:ascii="Arial" w:hAnsi="Arial" w:eastAsia="Arial"/>
+          <w:rFonts w:ascii="Times New Roman" w:hAnsi="Times New Roman" w:eastAsia="Times New Roman"/>
           <w:b w:val="0"/>
           <w:i w:val="0"/>
-          <w:sz w:val="19"/>
+          <w:color w:val="000000"/>
+          <w:sz w:val="15"/>
+          <w:u w:val="none"/>
         </w:rPr>
-        <w:t xml:space="preserve">–  </w:t>
+        <w:t>▪</w:t>
+        <w:tab/>
       </w:r>
       <w:r>
         <w:rPr>
-          <w:rFonts w:ascii="Arial" w:hAnsi="Arial" w:eastAsia="Arial"/>
+          <w:rFonts w:ascii="Times New Roman" w:hAnsi="Times New Roman" w:eastAsia="Times New Roman"/>
           <w:b w:val="0"/>
           <w:i w:val="0"/>
+          <w:color w:val="000000"/>
           <w:sz w:val="19"/>
+          <w:u w:val="none"/>
         </w:rPr>
         <w:t>Coordination métiers / IT pour la coconception des solutions</w:t>
       </w:r>
     </w:p>
     <w:p>
       <w:pPr>
-        <w:spacing w:before="0" w:after="20" w:line="252" w:lineRule="auto"/>
-        <w:ind w:left="567" w:hanging="198"/>
+        <w:keepNext w:val="0"/>
+        <w:tabs>
+          <w:tab w:pos="2381" w:val="left"/>
+        </w:tabs>
+        <w:spacing w:before="0" w:after="0" w:line="240" w:lineRule="auto"/>
+        <w:ind w:left="2381" w:hanging="227"/>
       </w:pPr>
       <w:r>
         <w:rPr>
-          <w:rFonts w:ascii="Arial" w:hAnsi="Arial" w:eastAsia="Arial"/>
+          <w:rFonts w:ascii="Times New Roman" w:hAnsi="Times New Roman" w:eastAsia="Times New Roman"/>
           <w:b w:val="0"/>
           <w:i w:val="0"/>
-          <w:sz w:val="19"/>
+          <w:color w:val="000000"/>
+          <w:sz w:val="15"/>
+          <w:u w:val="none"/>
         </w:rPr>
-        <w:t xml:space="preserve">–  </w:t>
+        <w:t>▪</w:t>
+        <w:tab/>
       </w:r>
       <w:r>
         <w:rPr>
-          <w:rFonts w:ascii="Arial" w:hAnsi="Arial" w:eastAsia="Arial"/>
+          <w:rFonts w:ascii="Times New Roman" w:hAnsi="Times New Roman" w:eastAsia="Times New Roman"/>
           <w:b w:val="0"/>
           <w:i w:val="0"/>
+          <w:color w:val="000000"/>
           <w:sz w:val="19"/>
+          <w:u w:val="none"/>
         </w:rPr>
         <w:t>Pilotage du développement, de la recette et de la mise en production</w:t>
       </w:r>
     </w:p>
     <w:p>
       <w:pPr>
-        <w:spacing w:before="0" w:after="20" w:line="252" w:lineRule="auto"/>
-        <w:ind w:left="567" w:hanging="198"/>
+        <w:keepNext w:val="0"/>
+        <w:tabs>
+          <w:tab w:pos="2381" w:val="left"/>
+        </w:tabs>
+        <w:spacing w:before="0" w:after="0" w:line="240" w:lineRule="auto"/>
+        <w:ind w:left="2381" w:hanging="227"/>
       </w:pPr>
       <w:r>
         <w:rPr>
-          <w:rFonts w:ascii="Arial" w:hAnsi="Arial" w:eastAsia="Arial"/>
+          <w:rFonts w:ascii="Times New Roman" w:hAnsi="Times New Roman" w:eastAsia="Times New Roman"/>
           <w:b w:val="0"/>
           <w:i w:val="0"/>
-          <w:sz w:val="19"/>
+          <w:color w:val="000000"/>
+          <w:sz w:val="15"/>
+          <w:u w:val="none"/>
         </w:rPr>
-        <w:t xml:space="preserve">–  </w:t>
+        <w:t>▪</w:t>
+        <w:tab/>
       </w:r>
       <w:r>
         <w:rPr>
-          <w:rFonts w:ascii="Arial" w:hAnsi="Arial" w:eastAsia="Arial"/>
+          <w:rFonts w:ascii="Times New Roman" w:hAnsi="Times New Roman" w:eastAsia="Times New Roman"/>
           <w:b w:val="0"/>
           <w:i w:val="0"/>
+          <w:color w:val="000000"/>
           <w:sz w:val="19"/>
+          <w:u w:val="none"/>
         </w:rPr>
         <w:t>Gestion des risques et animation des instances projets (COSUI, COPIL)</w:t>
       </w:r>
     </w:p>
     <w:p>
       <w:pPr>
-        <w:spacing w:before="0" w:after="20" w:line="252" w:lineRule="auto"/>
-        <w:ind w:left="567" w:hanging="198"/>
+        <w:keepNext w:val="0"/>
+        <w:tabs>
+          <w:tab w:pos="2381" w:val="left"/>
+        </w:tabs>
+        <w:spacing w:before="0" w:after="40" w:line="240" w:lineRule="auto"/>
+        <w:ind w:left="2381" w:hanging="227"/>
       </w:pPr>
       <w:r>
         <w:rPr>
-          <w:rFonts w:ascii="Arial" w:hAnsi="Arial" w:eastAsia="Arial"/>
+          <w:rFonts w:ascii="Times New Roman" w:hAnsi="Times New Roman" w:eastAsia="Times New Roman"/>
           <w:b w:val="0"/>
           <w:i w:val="0"/>
-          <w:sz w:val="19"/>
+          <w:color w:val="000000"/>
+          <w:sz w:val="15"/>
+          <w:u w:val="none"/>
         </w:rPr>
-        <w:t xml:space="preserve">–  </w:t>
+        <w:t>▪</w:t>
+        <w:tab/>
       </w:r>
       <w:r>
         <w:rPr>
-          <w:rFonts w:ascii="Arial" w:hAnsi="Arial" w:eastAsia="Arial"/>
+          <w:rFonts w:ascii="Times New Roman" w:hAnsi="Times New Roman" w:eastAsia="Times New Roman"/>
           <w:b w:val="0"/>
           <w:i w:val="0"/>
+          <w:color w:val="000000"/>
           <w:sz w:val="19"/>
+          <w:u w:val="none"/>
         </w:rPr>
         <w:t>Accompagnement du déploiement auprès des fonctions Finance et RH</w:t>
       </w:r>
     </w:p>
     <w:p>
       <w:pPr>
-        <w:spacing w:before="0" w:after="20" w:line="252" w:lineRule="auto"/>
-        <w:ind w:left="283" w:hanging="198"/>
+        <w:keepNext w:val="0"/>
+        <w:tabs>
+          <w:tab w:pos="2069" w:val="left"/>
+        </w:tabs>
+        <w:spacing w:before="0" w:after="20" w:line="240" w:lineRule="auto"/>
+        <w:ind w:left="2069" w:hanging="227"/>
       </w:pPr>
       <w:r>
         <w:rPr>
-          <w:rFonts w:ascii="Arial" w:hAnsi="Arial" w:eastAsia="Arial"/>
+          <w:rFonts w:ascii="Times New Roman" w:hAnsi="Times New Roman" w:eastAsia="Times New Roman"/>
           <w:b w:val="0"/>
           <w:i w:val="0"/>
+          <w:color w:val="000000"/>
           <w:sz w:val="19"/>
+          <w:u w:val="none"/>
         </w:rPr>
-        <w:t xml:space="preserve">•  </w:t>
+        <w:t>•</w:t>
+        <w:tab/>
       </w:r>
       <w:r>
         <w:rPr>
-          <w:rFonts w:ascii="Arial" w:hAnsi="Arial" w:eastAsia="Arial"/>
+          <w:rFonts w:ascii="Times New Roman" w:hAnsi="Times New Roman" w:eastAsia="Times New Roman"/>
           <w:b/>
           <w:i w:val="0"/>
+          <w:color w:val="000000"/>
           <w:sz w:val="19"/>
+          <w:u w:val="none"/>
         </w:rPr>
         <w:t>Phase RUN :</w:t>
       </w:r>
     </w:p>
     <w:p>
       <w:pPr>
-        <w:spacing w:before="0" w:after="20" w:line="252" w:lineRule="auto"/>
-        <w:ind w:left="567" w:hanging="198"/>
+        <w:keepNext w:val="0"/>
+        <w:tabs>
+          <w:tab w:pos="2381" w:val="left"/>
+        </w:tabs>
+        <w:spacing w:before="0" w:after="0" w:line="240" w:lineRule="auto"/>
+        <w:ind w:left="2381" w:hanging="227"/>
       </w:pPr>
       <w:r>
         <w:rPr>
-          <w:rFonts w:ascii="Arial" w:hAnsi="Arial" w:eastAsia="Arial"/>
+          <w:rFonts w:ascii="Times New Roman" w:hAnsi="Times New Roman" w:eastAsia="Times New Roman"/>
           <w:b w:val="0"/>
           <w:i w:val="0"/>
-          <w:sz w:val="19"/>
+          <w:color w:val="000000"/>
+          <w:sz w:val="15"/>
+          <w:u w:val="none"/>
         </w:rPr>
-        <w:t xml:space="preserve">–  </w:t>
+        <w:t>▪</w:t>
+        <w:tab/>
       </w:r>
       <w:r>
         <w:rPr>
-          <w:rFonts w:ascii="Arial" w:hAnsi="Arial" w:eastAsia="Arial"/>
+          <w:rFonts w:ascii="Times New Roman" w:hAnsi="Times New Roman" w:eastAsia="Times New Roman"/>
           <w:b w:val="0"/>
           <w:i w:val="0"/>
+          <w:color w:val="000000"/>
           <w:sz w:val="19"/>
+          <w:u w:val="none"/>
         </w:rPr>
         <w:t>Monitoring quotidien d'une dizaine de robots en production et gestion des incidents</w:t>
       </w:r>
     </w:p>
     <w:p>
       <w:pPr>
-        <w:spacing w:before="0" w:after="20" w:line="252" w:lineRule="auto"/>
-        <w:ind w:left="567" w:hanging="198"/>
+        <w:keepNext w:val="0"/>
+        <w:tabs>
+          <w:tab w:pos="2381" w:val="left"/>
+        </w:tabs>
+        <w:spacing w:before="0" w:after="0" w:line="240" w:lineRule="auto"/>
+        <w:ind w:left="2381" w:hanging="227"/>
       </w:pPr>
       <w:r>
         <w:rPr>
-          <w:rFonts w:ascii="Arial" w:hAnsi="Arial" w:eastAsia="Arial"/>
+          <w:rFonts w:ascii="Times New Roman" w:hAnsi="Times New Roman" w:eastAsia="Times New Roman"/>
           <w:b w:val="0"/>
           <w:i w:val="0"/>
-          <w:sz w:val="19"/>
+          <w:color w:val="000000"/>
+          <w:sz w:val="15"/>
+          <w:u w:val="none"/>
         </w:rPr>
-        <w:t xml:space="preserve">–  </w:t>
+        <w:t>▪</w:t>
+        <w:tab/>
       </w:r>
       <w:r>
         <w:rPr>
-          <w:rFonts w:ascii="Arial" w:hAnsi="Arial" w:eastAsia="Arial"/>
+          <w:rFonts w:ascii="Times New Roman" w:hAnsi="Times New Roman" w:eastAsia="Times New Roman"/>
           <w:b w:val="0"/>
           <w:i w:val="0"/>
+          <w:color w:val="000000"/>
           <w:sz w:val="19"/>
+          <w:u w:val="none"/>
         </w:rPr>
         <w:t>Suivi de la performance des solutions déployées (ROI, fiabilité, adoption)</w:t>
       </w:r>
     </w:p>
     <w:p>
       <w:pPr>
-        <w:spacing w:before="0" w:after="20" w:line="252" w:lineRule="auto"/>
-        <w:ind w:left="567" w:hanging="198"/>
+        <w:keepNext w:val="0"/>
+        <w:tabs>
+          <w:tab w:pos="2381" w:val="left"/>
+        </w:tabs>
+        <w:spacing w:before="0" w:after="40" w:line="240" w:lineRule="auto"/>
+        <w:ind w:left="2381" w:hanging="227"/>
       </w:pPr>
       <w:r>
         <w:rPr>
-          <w:rFonts w:ascii="Arial" w:hAnsi="Arial" w:eastAsia="Arial"/>
+          <w:rFonts w:ascii="Times New Roman" w:hAnsi="Times New Roman" w:eastAsia="Times New Roman"/>
           <w:b w:val="0"/>
           <w:i w:val="0"/>
-          <w:sz w:val="19"/>
+          <w:color w:val="000000"/>
+          <w:sz w:val="15"/>
+          <w:u w:val="none"/>
         </w:rPr>
-        <w:t xml:space="preserve">–  </w:t>
+        <w:t>▪</w:t>
+        <w:tab/>
       </w:r>
       <w:r>
         <w:rPr>
-          <w:rFonts w:ascii="Arial" w:hAnsi="Arial" w:eastAsia="Arial"/>
+          <w:rFonts w:ascii="Times New Roman" w:hAnsi="Times New Roman" w:eastAsia="Times New Roman"/>
           <w:b w:val="0"/>
           <w:i w:val="0"/>
+          <w:color w:val="000000"/>
           <w:sz w:val="19"/>
+          <w:u w:val="none"/>
         </w:rPr>
         <w:t>Identification et mise en œuvre d'axes d'amélioration continue</w:t>
       </w:r>
@@ -586,532 +834,943 @@
     <w:p>
       <w:pPr>
         <w:keepNext/>
-        <w:spacing w:before="100" w:after="0" w:line="240" w:lineRule="auto"/>
+        <w:tabs>
+          <w:tab w:pos="822" w:val="center"/>
+          <w:tab w:pos="1814" w:val="left"/>
+        </w:tabs>
+        <w:spacing w:before="120" w:after="40" w:line="240" w:lineRule="auto"/>
+        <w:ind w:left="1814" w:hanging="1814"/>
       </w:pPr>
       <w:r>
         <w:rPr>
-          <w:rFonts w:ascii="Arial" w:hAnsi="Arial" w:eastAsia="Arial"/>
-          <w:b/>
+          <w:rFonts w:ascii="Times New Roman" w:hAnsi="Times New Roman" w:eastAsia="Times New Roman"/>
+          <w:b w:val="0"/>
           <w:i w:val="0"/>
-          <w:color w:val="1F3A5F"/>
+          <w:color w:val="000000"/>
           <w:sz w:val="19"/>
+          <w:u w:val="none"/>
         </w:rPr>
-        <w:t xml:space="preserve">2018 – 2022 | </w:t>
+        <w:tab/>
+        <w:t>2018 – 2022</w:t>
+        <w:tab/>
       </w:r>
       <w:r>
         <w:rPr>
-          <w:rFonts w:ascii="Arial" w:hAnsi="Arial" w:eastAsia="Arial"/>
+          <w:rFonts w:ascii="Times New Roman" w:hAnsi="Times New Roman" w:eastAsia="Times New Roman"/>
           <w:b/>
           <w:i w:val="0"/>
+          <w:color w:val="000000"/>
           <w:sz w:val="19"/>
+          <w:u w:val="none"/>
         </w:rPr>
         <w:t>Retail &amp; VIP Guest Relations @ LOUIS VUITTON</w:t>
       </w:r>
     </w:p>
     <w:p>
       <w:pPr>
-        <w:spacing w:before="0" w:after="20" w:line="252" w:lineRule="auto"/>
-        <w:ind w:left="283" w:hanging="198"/>
+        <w:keepNext w:val="0"/>
+        <w:tabs>
+          <w:tab w:pos="2069" w:val="left"/>
+        </w:tabs>
+        <w:spacing w:before="0" w:after="40" w:line="240" w:lineRule="auto"/>
+        <w:ind w:left="2069" w:hanging="227"/>
       </w:pPr>
       <w:r>
         <w:rPr>
-          <w:rFonts w:ascii="Arial" w:hAnsi="Arial" w:eastAsia="Arial"/>
+          <w:rFonts w:ascii="Times New Roman" w:hAnsi="Times New Roman" w:eastAsia="Times New Roman"/>
           <w:b w:val="0"/>
           <w:i w:val="0"/>
+          <w:color w:val="000000"/>
           <w:sz w:val="19"/>
+          <w:u w:val="none"/>
         </w:rPr>
-        <w:t xml:space="preserve">•  </w:t>
+        <w:t>•</w:t>
+        <w:tab/>
       </w:r>
       <w:r>
         <w:rPr>
-          <w:rFonts w:ascii="Arial" w:hAnsi="Arial" w:eastAsia="Arial"/>
+          <w:rFonts w:ascii="Times New Roman" w:hAnsi="Times New Roman" w:eastAsia="Times New Roman"/>
           <w:b w:val="0"/>
           <w:i w:val="0"/>
+          <w:color w:val="000000"/>
           <w:sz w:val="19"/>
+          <w:u w:val="none"/>
         </w:rPr>
         <w:t>Gestion d'une clientèle VIP internationale dans un environnement exigeant</w:t>
       </w:r>
     </w:p>
     <w:p>
       <w:pPr>
-        <w:spacing w:before="0" w:after="20" w:line="252" w:lineRule="auto"/>
-        <w:ind w:left="283" w:hanging="198"/>
+        <w:keepNext w:val="0"/>
+        <w:tabs>
+          <w:tab w:pos="2069" w:val="left"/>
+        </w:tabs>
+        <w:spacing w:before="0" w:after="40" w:line="240" w:lineRule="auto"/>
+        <w:ind w:left="2069" w:hanging="227"/>
       </w:pPr>
       <w:r>
         <w:rPr>
-          <w:rFonts w:ascii="Arial" w:hAnsi="Arial" w:eastAsia="Arial"/>
+          <w:rFonts w:ascii="Times New Roman" w:hAnsi="Times New Roman" w:eastAsia="Times New Roman"/>
           <w:b w:val="0"/>
           <w:i w:val="0"/>
+          <w:color w:val="000000"/>
           <w:sz w:val="19"/>
+          <w:u w:val="none"/>
         </w:rPr>
-        <w:t xml:space="preserve">•  </w:t>
+        <w:t>•</w:t>
+        <w:tab/>
       </w:r>
       <w:r>
         <w:rPr>
-          <w:rFonts w:ascii="Arial" w:hAnsi="Arial" w:eastAsia="Arial"/>
+          <w:rFonts w:ascii="Times New Roman" w:hAnsi="Times New Roman" w:eastAsia="Times New Roman"/>
           <w:b w:val="0"/>
           <w:i w:val="0"/>
+          <w:color w:val="000000"/>
           <w:sz w:val="19"/>
+          <w:u w:val="none"/>
         </w:rPr>
         <w:t>Sens du service, communication et adaptation en contexte multiculturel</w:t>
       </w:r>
     </w:p>
     <w:p>
       <w:pPr>
-        <w:spacing w:before="140" w:after="60" w:line="240" w:lineRule="auto"/>
+        <w:keepNext w:val="0"/>
+        <w:spacing w:before="60" w:after="80" w:line="24" w:lineRule="auto"/>
+        <w:ind w:right="8391"/>
         <w:pBdr>
-          <w:bottom w:val="single" w:sz="6" w:space="1" w:color="1F3A5F"/>
+          <w:bottom w:val="single" w:sz="4" w:space="1" w:color="A6A6A6"/>
         </w:pBdr>
       </w:pPr>
       <w:r>
         <w:rPr>
-          <w:rFonts w:ascii="Arial" w:hAnsi="Arial" w:eastAsia="Arial"/>
-          <w:b/>
+          <w:rFonts w:ascii="Times New Roman" w:hAnsi="Times New Roman" w:eastAsia="Times New Roman"/>
+          <w:b w:val="0"/>
           <w:i w:val="0"/>
-          <w:color w:val="1F3A5F"/>
-          <w:sz w:val="21"/>
+          <w:color w:val="000000"/>
+          <w:sz w:val="4"/>
+          <w:u w:val="none"/>
+        </w:rPr>
+      </w:r>
+    </w:p>
+    <w:p>
+      <w:pPr>
+        <w:keepNext/>
+        <w:spacing w:before="0" w:after="100" w:line="240" w:lineRule="auto"/>
+      </w:pPr>
+      <w:r>
+        <w:rPr>
+          <w:rFonts w:ascii="Times New Roman" w:hAnsi="Times New Roman" w:eastAsia="Times New Roman"/>
+          <w:b w:val="0"/>
+          <w:i w:val="0"/>
+          <w:color w:val="000000"/>
+          <w:sz w:val="19"/>
+          <w:u w:val="none"/>
         </w:rPr>
         <w:t>FORMATION</w:t>
       </w:r>
     </w:p>
     <w:p>
       <w:pPr>
+        <w:keepNext/>
         <w:tabs>
-          <w:tab w:pos="1474" w:val="left"/>
+          <w:tab w:pos="822" w:val="center"/>
+          <w:tab w:pos="1814" w:val="left"/>
         </w:tabs>
         <w:spacing w:before="0" w:after="0" w:line="240" w:lineRule="auto"/>
-        <w:ind w:left="1474" w:hanging="1474"/>
+        <w:ind w:left="1814" w:hanging="1814"/>
       </w:pPr>
       <w:r>
         <w:rPr>
-          <w:rFonts w:ascii="Arial" w:hAnsi="Arial" w:eastAsia="Arial"/>
-          <w:b/>
-          <w:i w:val="0"/>
-          <w:color w:val="1F3A5F"/>
-          <w:sz w:val="19"/>
-        </w:rPr>
-        <w:t>2024 – 2025</w:t>
-      </w:r>
-      <w:r>
-        <w:rPr>
-          <w:rFonts w:ascii="Arial" w:hAnsi="Arial" w:eastAsia="Arial"/>
+          <w:rFonts w:ascii="Times New Roman" w:hAnsi="Times New Roman" w:eastAsia="Times New Roman"/>
           <w:b w:val="0"/>
           <w:i w:val="0"/>
+          <w:color w:val="000000"/>
           <w:sz w:val="19"/>
+          <w:u w:val="none"/>
         </w:rPr>
+        <w:tab/>
+        <w:t>2024 – 2025</w:t>
         <w:tab/>
       </w:r>
       <w:r>
         <w:rPr>
-          <w:rFonts w:ascii="Arial" w:hAnsi="Arial" w:eastAsia="Arial"/>
+          <w:rFonts w:ascii="Times New Roman" w:hAnsi="Times New Roman" w:eastAsia="Times New Roman"/>
           <w:b/>
           <w:i w:val="0"/>
+          <w:color w:val="000000"/>
           <w:sz w:val="19"/>
+          <w:u w:val="none"/>
         </w:rPr>
         <w:t>Mastère spécialisé en Management des Systèmes d'Information en Réseaux</w:t>
       </w:r>
       <w:r>
         <w:rPr>
-          <w:rFonts w:ascii="Arial" w:hAnsi="Arial" w:eastAsia="Arial"/>
+          <w:rFonts w:ascii="Times New Roman" w:hAnsi="Times New Roman" w:eastAsia="Times New Roman"/>
           <w:b w:val="0"/>
           <w:i w:val="0"/>
+          <w:color w:val="000000"/>
           <w:sz w:val="19"/>
+          <w:u w:val="none"/>
         </w:rPr>
         <w:t xml:space="preserve"> – Major de promotion</w:t>
       </w:r>
     </w:p>
     <w:p>
       <w:pPr>
-        <w:spacing w:before="0" w:after="40" w:line="240" w:lineRule="auto"/>
-        <w:ind w:left="1474"/>
+        <w:keepNext w:val="0"/>
+        <w:spacing w:before="0" w:after="0" w:line="240" w:lineRule="auto"/>
+        <w:ind w:left="1814"/>
       </w:pPr>
       <w:r>
         <w:rPr>
-          <w:rFonts w:ascii="Arial" w:hAnsi="Arial" w:eastAsia="Arial"/>
+          <w:rFonts w:ascii="Times New Roman" w:hAnsi="Times New Roman" w:eastAsia="Times New Roman"/>
           <w:b w:val="0"/>
-          <w:i/>
-          <w:color w:val="555555"/>
+          <w:i w:val="0"/>
+          <w:color w:val="000000"/>
           <w:sz w:val="19"/>
+          <w:u w:val="none"/>
         </w:rPr>
         <w:t>ESSEC Business School &amp; Télécom Paris</w:t>
       </w:r>
     </w:p>
     <w:p>
       <w:pPr>
+        <w:keepNext/>
         <w:tabs>
-          <w:tab w:pos="1474" w:val="left"/>
+          <w:tab w:pos="822" w:val="center"/>
+          <w:tab w:pos="1814" w:val="left"/>
         </w:tabs>
-        <w:spacing w:before="0" w:after="0" w:line="240" w:lineRule="auto"/>
-        <w:ind w:left="1474" w:hanging="1474"/>
+        <w:spacing w:before="80" w:after="0" w:line="240" w:lineRule="auto"/>
+        <w:ind w:left="1814" w:hanging="1814"/>
       </w:pPr>
       <w:r>
         <w:rPr>
-          <w:rFonts w:ascii="Arial" w:hAnsi="Arial" w:eastAsia="Arial"/>
-          <w:b/>
-          <w:i w:val="0"/>
-          <w:color w:val="1F3A5F"/>
-          <w:sz w:val="19"/>
-        </w:rPr>
-        <w:t>2022 – 2023</w:t>
-      </w:r>
-      <w:r>
-        <w:rPr>
-          <w:rFonts w:ascii="Arial" w:hAnsi="Arial" w:eastAsia="Arial"/>
+          <w:rFonts w:ascii="Times New Roman" w:hAnsi="Times New Roman" w:eastAsia="Times New Roman"/>
           <w:b w:val="0"/>
           <w:i w:val="0"/>
+          <w:color w:val="000000"/>
           <w:sz w:val="19"/>
+          <w:u w:val="none"/>
         </w:rPr>
+        <w:tab/>
+        <w:t>2022 – 2023</w:t>
         <w:tab/>
       </w:r>
       <w:r>
         <w:rPr>
-          <w:rFonts w:ascii="Arial" w:hAnsi="Arial" w:eastAsia="Arial"/>
+          <w:rFonts w:ascii="Times New Roman" w:hAnsi="Times New Roman" w:eastAsia="Times New Roman"/>
           <w:b/>
           <w:i w:val="0"/>
+          <w:color w:val="000000"/>
           <w:sz w:val="19"/>
+          <w:u w:val="none"/>
         </w:rPr>
         <w:t>Master 2 en Projets Informatiques et Stratégie d'entreprise</w:t>
       </w:r>
       <w:r>
         <w:rPr>
-          <w:rFonts w:ascii="Arial" w:hAnsi="Arial" w:eastAsia="Arial"/>
+          <w:rFonts w:ascii="Times New Roman" w:hAnsi="Times New Roman" w:eastAsia="Times New Roman"/>
           <w:b w:val="0"/>
           <w:i w:val="0"/>
+          <w:color w:val="000000"/>
           <w:sz w:val="19"/>
+          <w:u w:val="none"/>
         </w:rPr>
         <w:t xml:space="preserve"> – Major de promotion</w:t>
       </w:r>
     </w:p>
     <w:p>
       <w:pPr>
-        <w:spacing w:before="0" w:after="40" w:line="240" w:lineRule="auto"/>
-        <w:ind w:left="1474"/>
+        <w:keepNext w:val="0"/>
+        <w:spacing w:before="0" w:after="0" w:line="240" w:lineRule="auto"/>
+        <w:ind w:left="1814"/>
       </w:pPr>
       <w:r>
         <w:rPr>
-          <w:rFonts w:ascii="Arial" w:hAnsi="Arial" w:eastAsia="Arial"/>
+          <w:rFonts w:ascii="Times New Roman" w:hAnsi="Times New Roman" w:eastAsia="Times New Roman"/>
           <w:b w:val="0"/>
-          <w:i/>
-          <w:color w:val="555555"/>
+          <w:i w:val="0"/>
+          <w:color w:val="000000"/>
           <w:sz w:val="19"/>
+          <w:u w:val="none"/>
         </w:rPr>
         <w:t>Université Paris Cité</w:t>
       </w:r>
     </w:p>
     <w:p>
       <w:pPr>
+        <w:keepNext/>
         <w:tabs>
-          <w:tab w:pos="1474" w:val="left"/>
+          <w:tab w:pos="822" w:val="center"/>
+          <w:tab w:pos="1814" w:val="left"/>
         </w:tabs>
-        <w:spacing w:before="0" w:after="20" w:line="240" w:lineRule="auto"/>
-        <w:ind w:left="1474" w:hanging="1474"/>
+        <w:spacing w:before="80" w:after="0" w:line="240" w:lineRule="auto"/>
+        <w:ind w:left="1814" w:hanging="1814"/>
       </w:pPr>
       <w:r>
         <w:rPr>
-          <w:rFonts w:ascii="Arial" w:hAnsi="Arial" w:eastAsia="Arial"/>
-          <w:b/>
-          <w:i w:val="0"/>
-          <w:color w:val="1F3A5F"/>
-          <w:sz w:val="19"/>
-        </w:rPr>
-        <w:t>Avant 2016</w:t>
-      </w:r>
-      <w:r>
-        <w:rPr>
-          <w:rFonts w:ascii="Arial" w:hAnsi="Arial" w:eastAsia="Arial"/>
+          <w:rFonts w:ascii="Times New Roman" w:hAnsi="Times New Roman" w:eastAsia="Times New Roman"/>
           <w:b w:val="0"/>
           <w:i w:val="0"/>
+          <w:color w:val="000000"/>
           <w:sz w:val="19"/>
+          <w:u w:val="none"/>
         </w:rPr>
+        <w:tab/>
+        <w:t>Avant 2016</w:t>
         <w:tab/>
       </w:r>
       <w:r>
         <w:rPr>
-          <w:rFonts w:ascii="Arial" w:hAnsi="Arial" w:eastAsia="Arial"/>
+          <w:rFonts w:ascii="Times New Roman" w:hAnsi="Times New Roman" w:eastAsia="Times New Roman"/>
           <w:b/>
           <w:i w:val="0"/>
+          <w:color w:val="000000"/>
           <w:sz w:val="19"/>
+          <w:u w:val="none"/>
         </w:rPr>
         <w:t>Master en Littératures Françaises</w:t>
       </w:r>
       <w:r>
         <w:rPr>
-          <w:rFonts w:ascii="Arial" w:hAnsi="Arial" w:eastAsia="Arial"/>
+          <w:rFonts w:ascii="Times New Roman" w:hAnsi="Times New Roman" w:eastAsia="Times New Roman"/>
           <w:b w:val="0"/>
           <w:i w:val="0"/>
+          <w:color w:val="000000"/>
           <w:sz w:val="19"/>
+          <w:u w:val="none"/>
         </w:rPr>
         <w:t xml:space="preserve"> – Université Paris-Sorbonne</w:t>
       </w:r>
     </w:p>
     <w:p>
       <w:pPr>
+        <w:keepNext/>
         <w:tabs>
-          <w:tab w:pos="1474" w:val="left"/>
+          <w:tab w:pos="822" w:val="center"/>
+          <w:tab w:pos="1814" w:val="left"/>
         </w:tabs>
-        <w:spacing w:before="0" w:after="20" w:line="240" w:lineRule="auto"/>
-        <w:ind w:left="1474" w:hanging="1474"/>
+        <w:spacing w:before="0" w:after="0" w:line="240" w:lineRule="auto"/>
+        <w:ind w:left="1814" w:hanging="1814"/>
       </w:pPr>
       <w:r>
         <w:rPr>
-          <w:rFonts w:ascii="Arial" w:hAnsi="Arial" w:eastAsia="Arial"/>
-          <w:b/>
-          <w:i w:val="0"/>
-          <w:color w:val="1F3A5F"/>
-          <w:sz w:val="19"/>
-        </w:rPr>
-      </w:r>
-      <w:r>
-        <w:rPr>
-          <w:rFonts w:ascii="Arial" w:hAnsi="Arial" w:eastAsia="Arial"/>
+          <w:rFonts w:ascii="Times New Roman" w:hAnsi="Times New Roman" w:eastAsia="Times New Roman"/>
           <w:b w:val="0"/>
           <w:i w:val="0"/>
+          <w:color w:val="000000"/>
           <w:sz w:val="19"/>
+          <w:u w:val="none"/>
         </w:rPr>
+        <w:tab/>
         <w:tab/>
       </w:r>
       <w:r>
         <w:rPr>
-          <w:rFonts w:ascii="Arial" w:hAnsi="Arial" w:eastAsia="Arial"/>
+          <w:rFonts w:ascii="Times New Roman" w:hAnsi="Times New Roman" w:eastAsia="Times New Roman"/>
           <w:b/>
           <w:i w:val="0"/>
+          <w:color w:val="000000"/>
           <w:sz w:val="19"/>
+          <w:u w:val="none"/>
         </w:rPr>
         <w:t>Licence en Langue Française</w:t>
       </w:r>
       <w:r>
         <w:rPr>
-          <w:rFonts w:ascii="Arial" w:hAnsi="Arial" w:eastAsia="Arial"/>
+          <w:rFonts w:ascii="Times New Roman" w:hAnsi="Times New Roman" w:eastAsia="Times New Roman"/>
           <w:b w:val="0"/>
           <w:i w:val="0"/>
+          <w:color w:val="000000"/>
           <w:sz w:val="19"/>
+          <w:u w:val="none"/>
         </w:rPr>
         <w:t xml:space="preserve"> – Xi'an JiaoTong University, Chine</w:t>
       </w:r>
     </w:p>
     <w:p>
       <w:pPr>
-        <w:spacing w:before="140" w:after="60" w:line="240" w:lineRule="auto"/>
+        <w:keepNext w:val="0"/>
+        <w:spacing w:before="60" w:after="80" w:line="24" w:lineRule="auto"/>
+        <w:ind w:right="8391"/>
         <w:pBdr>
-          <w:bottom w:val="single" w:sz="6" w:space="1" w:color="1F3A5F"/>
+          <w:bottom w:val="single" w:sz="4" w:space="1" w:color="A6A6A6"/>
         </w:pBdr>
       </w:pPr>
       <w:r>
         <w:rPr>
-          <w:rFonts w:ascii="Arial" w:hAnsi="Arial" w:eastAsia="Arial"/>
-          <w:b/>
+          <w:rFonts w:ascii="Times New Roman" w:hAnsi="Times New Roman" w:eastAsia="Times New Roman"/>
+          <w:b w:val="0"/>
           <w:i w:val="0"/>
-          <w:color w:val="1F3A5F"/>
-          <w:sz w:val="21"/>
+          <w:color w:val="000000"/>
+          <w:sz w:val="4"/>
+          <w:u w:val="none"/>
         </w:rPr>
-        <w:t>COMPÉTENCES</w:t>
       </w:r>
     </w:p>
     <w:p>
       <w:pPr>
-        <w:spacing w:before="0" w:after="20" w:line="252" w:lineRule="auto"/>
+        <w:keepNext w:val="0"/>
+        <w:tabs>
+          <w:tab w:pos="1814" w:val="left"/>
+          <w:tab w:pos="3798" w:val="left"/>
+        </w:tabs>
+        <w:spacing w:before="0" w:after="40" w:line="240" w:lineRule="auto"/>
+        <w:ind w:left="3798" w:hanging="3798"/>
       </w:pPr>
       <w:r>
         <w:rPr>
-          <w:rFonts w:ascii="Arial" w:hAnsi="Arial" w:eastAsia="Arial"/>
-          <w:b/>
+          <w:rFonts w:ascii="Times New Roman" w:hAnsi="Times New Roman" w:eastAsia="Times New Roman"/>
+          <w:b w:val="0"/>
           <w:i w:val="0"/>
+          <w:color w:val="000000"/>
           <w:sz w:val="19"/>
+          <w:u w:val="none"/>
         </w:rPr>
-        <w:t xml:space="preserve">Gestion de projet : </w:t>
+        <w:t>COMPÉTENCES</w:t>
       </w:r>
       <w:r>
         <w:rPr>
-          <w:rFonts w:ascii="Arial" w:hAnsi="Arial" w:eastAsia="Arial"/>
+          <w:rFonts w:ascii="Times New Roman" w:hAnsi="Times New Roman" w:eastAsia="Times New Roman"/>
           <w:b w:val="0"/>
           <w:i w:val="0"/>
+          <w:color w:val="000000"/>
           <w:sz w:val="19"/>
+          <w:u w:val="none"/>
         </w:rPr>
-        <w:t>cadrage, recueil des besoins, cahier des charges, spécifications fonctionnelles, planification, coordination métiers / IT, recette, mise en production, gestion des risques, COPIL / COSUI</w:t>
+        <w:tab/>
+      </w:r>
+      <w:r>
+        <w:rPr>
+          <w:rFonts w:ascii="Times New Roman" w:hAnsi="Times New Roman" w:eastAsia="Times New Roman"/>
+          <w:b/>
+          <w:i w:val="0"/>
+          <w:color w:val="000000"/>
+          <w:sz w:val="19"/>
+          <w:u w:val="none"/>
+        </w:rPr>
+        <w:t>Gestion de projet :</w:t>
+      </w:r>
+      <w:r>
+        <w:rPr>
+          <w:rFonts w:ascii="Times New Roman" w:hAnsi="Times New Roman" w:eastAsia="Times New Roman"/>
+          <w:b w:val="0"/>
+          <w:i w:val="0"/>
+          <w:color w:val="000000"/>
+          <w:sz w:val="19"/>
+          <w:u w:val="none"/>
+        </w:rPr>
+        <w:tab/>
+        <w:t>cadrage, recueil des besoins, spécifications fonctionnelles, coordination métiers / IT, recette, mise en production, gestion des risques, COPIL / COSUI</w:t>
       </w:r>
     </w:p>
     <w:p>
       <w:pPr>
-        <w:spacing w:before="0" w:after="20" w:line="252" w:lineRule="auto"/>
+        <w:keepNext w:val="0"/>
+        <w:tabs>
+          <w:tab w:pos="1814" w:val="left"/>
+          <w:tab w:pos="3798" w:val="left"/>
+        </w:tabs>
+        <w:spacing w:before="0" w:after="40" w:line="240" w:lineRule="auto"/>
+        <w:ind w:left="3798" w:hanging="3798"/>
       </w:pPr>
       <w:r>
         <w:rPr>
-          <w:rFonts w:ascii="Arial" w:hAnsi="Arial" w:eastAsia="Arial"/>
-          <w:b/>
+          <w:rFonts w:ascii="Times New Roman" w:hAnsi="Times New Roman" w:eastAsia="Times New Roman"/>
+          <w:b w:val="0"/>
           <w:i w:val="0"/>
+          <w:color w:val="000000"/>
           <w:sz w:val="19"/>
+          <w:u w:val="none"/>
         </w:rPr>
-        <w:t xml:space="preserve">Méthodologies : </w:t>
       </w:r>
       <w:r>
         <w:rPr>
-          <w:rFonts w:ascii="Arial" w:hAnsi="Arial" w:eastAsia="Arial"/>
+          <w:rFonts w:ascii="Times New Roman" w:hAnsi="Times New Roman" w:eastAsia="Times New Roman"/>
           <w:b w:val="0"/>
           <w:i w:val="0"/>
+          <w:color w:val="000000"/>
           <w:sz w:val="19"/>
+          <w:u w:val="none"/>
         </w:rPr>
+        <w:tab/>
+      </w:r>
+      <w:r>
+        <w:rPr>
+          <w:rFonts w:ascii="Times New Roman" w:hAnsi="Times New Roman" w:eastAsia="Times New Roman"/>
+          <w:b/>
+          <w:i w:val="0"/>
+          <w:color w:val="000000"/>
+          <w:sz w:val="19"/>
+          <w:u w:val="none"/>
+        </w:rPr>
+        <w:t>Méthodologies :</w:t>
+      </w:r>
+      <w:r>
+        <w:rPr>
+          <w:rFonts w:ascii="Times New Roman" w:hAnsi="Times New Roman" w:eastAsia="Times New Roman"/>
+          <w:b w:val="0"/>
+          <w:i w:val="0"/>
+          <w:color w:val="000000"/>
+          <w:sz w:val="19"/>
+          <w:u w:val="none"/>
+        </w:rPr>
+        <w:tab/>
         <w:t>Cycle en V, Agile, hybride</w:t>
       </w:r>
     </w:p>
     <w:p>
       <w:pPr>
-        <w:spacing w:before="0" w:after="20" w:line="252" w:lineRule="auto"/>
+        <w:keepNext w:val="0"/>
+        <w:tabs>
+          <w:tab w:pos="1814" w:val="left"/>
+          <w:tab w:pos="3798" w:val="left"/>
+        </w:tabs>
+        <w:spacing w:before="0" w:after="40" w:line="240" w:lineRule="auto"/>
+        <w:ind w:left="3798" w:hanging="3798"/>
       </w:pPr>
       <w:r>
         <w:rPr>
-          <w:rFonts w:ascii="Arial" w:hAnsi="Arial" w:eastAsia="Arial"/>
-          <w:b/>
+          <w:rFonts w:ascii="Times New Roman" w:hAnsi="Times New Roman" w:eastAsia="Times New Roman"/>
+          <w:b w:val="0"/>
           <w:i w:val="0"/>
+          <w:color w:val="000000"/>
           <w:sz w:val="19"/>
+          <w:u w:val="none"/>
         </w:rPr>
-        <w:t xml:space="preserve">Transformation &amp; IA : </w:t>
       </w:r>
       <w:r>
         <w:rPr>
-          <w:rFonts w:ascii="Arial" w:hAnsi="Arial" w:eastAsia="Arial"/>
+          <w:rFonts w:ascii="Times New Roman" w:hAnsi="Times New Roman" w:eastAsia="Times New Roman"/>
           <w:b w:val="0"/>
           <w:i w:val="0"/>
+          <w:color w:val="000000"/>
           <w:sz w:val="19"/>
+          <w:u w:val="none"/>
         </w:rPr>
-        <w:t>GenAI, RAG, Copilot, RPA, POC, qualification de use cases, ROI, conduite du changement</w:t>
+        <w:tab/>
+      </w:r>
+      <w:r>
+        <w:rPr>
+          <w:rFonts w:ascii="Times New Roman" w:hAnsi="Times New Roman" w:eastAsia="Times New Roman"/>
+          <w:b/>
+          <w:i w:val="0"/>
+          <w:color w:val="000000"/>
+          <w:sz w:val="19"/>
+          <w:u w:val="none"/>
+        </w:rPr>
+        <w:t>Transformation &amp; IA :</w:t>
+      </w:r>
+      <w:r>
+        <w:rPr>
+          <w:rFonts w:ascii="Times New Roman" w:hAnsi="Times New Roman" w:eastAsia="Times New Roman"/>
+          <w:b w:val="0"/>
+          <w:i w:val="0"/>
+          <w:color w:val="000000"/>
+          <w:sz w:val="19"/>
+          <w:u w:val="none"/>
+        </w:rPr>
+        <w:tab/>
+        <w:t>GenAI, RAG, Copilot, RPA, POC, use cases, ROI, conduite du changement</w:t>
       </w:r>
     </w:p>
     <w:p>
       <w:pPr>
-        <w:spacing w:before="0" w:after="20" w:line="252" w:lineRule="auto"/>
+        <w:keepNext w:val="0"/>
+        <w:tabs>
+          <w:tab w:pos="1814" w:val="left"/>
+          <w:tab w:pos="3798" w:val="left"/>
+        </w:tabs>
+        <w:spacing w:before="0" w:after="40" w:line="240" w:lineRule="auto"/>
+        <w:ind w:left="3798" w:hanging="3798"/>
       </w:pPr>
       <w:r>
         <w:rPr>
-          <w:rFonts w:ascii="Arial" w:hAnsi="Arial" w:eastAsia="Arial"/>
-          <w:b/>
+          <w:rFonts w:ascii="Times New Roman" w:hAnsi="Times New Roman" w:eastAsia="Times New Roman"/>
+          <w:b w:val="0"/>
           <w:i w:val="0"/>
+          <w:color w:val="000000"/>
           <w:sz w:val="19"/>
+          <w:u w:val="none"/>
         </w:rPr>
-        <w:t xml:space="preserve">Environnement SI : </w:t>
       </w:r>
       <w:r>
         <w:rPr>
-          <w:rFonts w:ascii="Arial" w:hAnsi="Arial" w:eastAsia="Arial"/>
+          <w:rFonts w:ascii="Times New Roman" w:hAnsi="Times New Roman" w:eastAsia="Times New Roman"/>
           <w:b w:val="0"/>
           <w:i w:val="0"/>
+          <w:color w:val="000000"/>
           <w:sz w:val="19"/>
+          <w:u w:val="none"/>
         </w:rPr>
-        <w:t>SI Finance, SIRH, SAP, intégration applicative, sécurité, conformité et gouvernance des SI</w:t>
+        <w:tab/>
+      </w:r>
+      <w:r>
+        <w:rPr>
+          <w:rFonts w:ascii="Times New Roman" w:hAnsi="Times New Roman" w:eastAsia="Times New Roman"/>
+          <w:b/>
+          <w:i w:val="0"/>
+          <w:color w:val="000000"/>
+          <w:sz w:val="19"/>
+          <w:u w:val="none"/>
+        </w:rPr>
+        <w:t>Environnement SI :</w:t>
+      </w:r>
+      <w:r>
+        <w:rPr>
+          <w:rFonts w:ascii="Times New Roman" w:hAnsi="Times New Roman" w:eastAsia="Times New Roman"/>
+          <w:b w:val="0"/>
+          <w:i w:val="0"/>
+          <w:color w:val="000000"/>
+          <w:sz w:val="19"/>
+          <w:u w:val="none"/>
+        </w:rPr>
+        <w:tab/>
+        <w:t>SI Finance, SIRH, SAP, intégration, sécurité, conformité, gouvernance SI</w:t>
       </w:r>
     </w:p>
     <w:p>
       <w:pPr>
-        <w:spacing w:before="0" w:after="20" w:line="252" w:lineRule="auto"/>
+        <w:keepNext w:val="0"/>
+        <w:tabs>
+          <w:tab w:pos="1814" w:val="left"/>
+          <w:tab w:pos="3798" w:val="left"/>
+        </w:tabs>
+        <w:spacing w:before="0" w:after="40" w:line="240" w:lineRule="auto"/>
+        <w:ind w:left="3798" w:hanging="3798"/>
       </w:pPr>
       <w:r>
         <w:rPr>
-          <w:rFonts w:ascii="Arial" w:hAnsi="Arial" w:eastAsia="Arial"/>
-          <w:b/>
+          <w:rFonts w:ascii="Times New Roman" w:hAnsi="Times New Roman" w:eastAsia="Times New Roman"/>
+          <w:b w:val="0"/>
           <w:i w:val="0"/>
+          <w:color w:val="000000"/>
           <w:sz w:val="19"/>
+          <w:u w:val="none"/>
         </w:rPr>
-        <w:t xml:space="preserve">Outils : </w:t>
       </w:r>
       <w:r>
         <w:rPr>
-          <w:rFonts w:ascii="Arial" w:hAnsi="Arial" w:eastAsia="Arial"/>
+          <w:rFonts w:ascii="Times New Roman" w:hAnsi="Times New Roman" w:eastAsia="Times New Roman"/>
           <w:b w:val="0"/>
           <w:i w:val="0"/>
+          <w:color w:val="000000"/>
           <w:sz w:val="19"/>
+          <w:u w:val="none"/>
         </w:rPr>
+        <w:tab/>
+      </w:r>
+      <w:r>
+        <w:rPr>
+          <w:rFonts w:ascii="Times New Roman" w:hAnsi="Times New Roman" w:eastAsia="Times New Roman"/>
+          <w:b/>
+          <w:i w:val="0"/>
+          <w:color w:val="000000"/>
+          <w:sz w:val="19"/>
+          <w:u w:val="none"/>
+        </w:rPr>
+        <w:t>Outils :</w:t>
+      </w:r>
+      <w:r>
+        <w:rPr>
+          <w:rFonts w:ascii="Times New Roman" w:hAnsi="Times New Roman" w:eastAsia="Times New Roman"/>
+          <w:b w:val="0"/>
+          <w:i w:val="0"/>
+          <w:color w:val="000000"/>
+          <w:sz w:val="19"/>
+          <w:u w:val="none"/>
+        </w:rPr>
+        <w:tab/>
         <w:t>Power Apps, Power Automate, Power BI, SharePoint</w:t>
       </w:r>
     </w:p>
     <w:p>
       <w:pPr>
-        <w:spacing w:before="0" w:after="20" w:line="252" w:lineRule="auto"/>
+        <w:keepNext w:val="0"/>
+        <w:tabs>
+          <w:tab w:pos="1814" w:val="left"/>
+          <w:tab w:pos="3798" w:val="left"/>
+        </w:tabs>
+        <w:spacing w:before="0" w:after="40" w:line="240" w:lineRule="auto"/>
+        <w:ind w:left="3798" w:hanging="3798"/>
       </w:pPr>
       <w:r>
         <w:rPr>
-          <w:rFonts w:ascii="Arial" w:hAnsi="Arial" w:eastAsia="Arial"/>
-          <w:b/>
+          <w:rFonts w:ascii="Times New Roman" w:hAnsi="Times New Roman" w:eastAsia="Times New Roman"/>
+          <w:b w:val="0"/>
           <w:i w:val="0"/>
+          <w:color w:val="000000"/>
           <w:sz w:val="19"/>
+          <w:u w:val="none"/>
         </w:rPr>
-        <w:t xml:space="preserve">Langages (notions) : </w:t>
       </w:r>
       <w:r>
         <w:rPr>
-          <w:rFonts w:ascii="Arial" w:hAnsi="Arial" w:eastAsia="Arial"/>
+          <w:rFonts w:ascii="Times New Roman" w:hAnsi="Times New Roman" w:eastAsia="Times New Roman"/>
           <w:b w:val="0"/>
           <w:i w:val="0"/>
+          <w:color w:val="000000"/>
           <w:sz w:val="19"/>
+          <w:u w:val="none"/>
         </w:rPr>
+        <w:tab/>
+      </w:r>
+      <w:r>
+        <w:rPr>
+          <w:rFonts w:ascii="Times New Roman" w:hAnsi="Times New Roman" w:eastAsia="Times New Roman"/>
+          <w:b/>
+          <w:i w:val="0"/>
+          <w:color w:val="000000"/>
+          <w:sz w:val="19"/>
+          <w:u w:val="none"/>
+        </w:rPr>
+        <w:t>Langages (notions) :</w:t>
+      </w:r>
+      <w:r>
+        <w:rPr>
+          <w:rFonts w:ascii="Times New Roman" w:hAnsi="Times New Roman" w:eastAsia="Times New Roman"/>
+          <w:b w:val="0"/>
+          <w:i w:val="0"/>
+          <w:color w:val="000000"/>
+          <w:sz w:val="19"/>
+          <w:u w:val="none"/>
+        </w:rPr>
+        <w:tab/>
         <w:t>Python, SQL, Java, PHP, C, C#, HTML/CSS</w:t>
       </w:r>
     </w:p>
     <w:p>
       <w:pPr>
-        <w:spacing w:before="140" w:after="60" w:line="240" w:lineRule="auto"/>
+        <w:keepNext w:val="0"/>
+        <w:spacing w:before="60" w:after="80" w:line="24" w:lineRule="auto"/>
+        <w:ind w:right="8391"/>
         <w:pBdr>
-          <w:bottom w:val="single" w:sz="6" w:space="1" w:color="1F3A5F"/>
+          <w:bottom w:val="single" w:sz="4" w:space="1" w:color="A6A6A6"/>
         </w:pBdr>
       </w:pPr>
       <w:r>
         <w:rPr>
-          <w:rFonts w:ascii="Arial" w:hAnsi="Arial" w:eastAsia="Arial"/>
-          <w:b/>
+          <w:rFonts w:ascii="Times New Roman" w:hAnsi="Times New Roman" w:eastAsia="Times New Roman"/>
+          <w:b w:val="0"/>
           <w:i w:val="0"/>
-          <w:color w:val="1F3A5F"/>
-          <w:sz w:val="21"/>
+          <w:color w:val="000000"/>
+          <w:sz w:val="4"/>
+          <w:u w:val="none"/>
         </w:rPr>
-        <w:t>LANGUES</w:t>
       </w:r>
     </w:p>
     <w:p>
       <w:pPr>
-        <w:spacing w:before="0" w:after="0" w:line="240" w:lineRule="auto"/>
+        <w:keepNext w:val="0"/>
+        <w:tabs>
+          <w:tab w:pos="1814" w:val="left"/>
+          <w:tab w:pos="3798" w:val="left"/>
+        </w:tabs>
+        <w:spacing w:before="0" w:after="20" w:line="240" w:lineRule="auto"/>
+        <w:ind w:left="3798" w:hanging="3798"/>
       </w:pPr>
       <w:r>
         <w:rPr>
-          <w:rFonts w:ascii="Arial" w:hAnsi="Arial" w:eastAsia="Arial"/>
+          <w:rFonts w:ascii="Times New Roman" w:hAnsi="Times New Roman" w:eastAsia="Times New Roman"/>
           <w:b w:val="0"/>
           <w:i w:val="0"/>
+          <w:color w:val="000000"/>
           <w:sz w:val="19"/>
+          <w:u w:val="none"/>
         </w:rPr>
-        <w:t>Anglais : professionnel (TOEIC 955/990) | Français : bilingue | Chinois : langue maternelle</w:t>
+        <w:t>LANGUES</w:t>
+      </w:r>
+      <w:r>
+        <w:rPr>
+          <w:rFonts w:ascii="Times New Roman" w:hAnsi="Times New Roman" w:eastAsia="Times New Roman"/>
+          <w:b w:val="0"/>
+          <w:i w:val="0"/>
+          <w:color w:val="000000"/>
+          <w:sz w:val="19"/>
+          <w:u w:val="none"/>
+        </w:rPr>
+        <w:tab/>
+      </w:r>
+      <w:r>
+        <w:rPr>
+          <w:rFonts w:ascii="Times New Roman" w:hAnsi="Times New Roman" w:eastAsia="Times New Roman"/>
+          <w:b/>
+          <w:i w:val="0"/>
+          <w:color w:val="000000"/>
+          <w:sz w:val="19"/>
+          <w:u w:val="none"/>
+        </w:rPr>
+        <w:t>Anglais</w:t>
+      </w:r>
+      <w:r>
+        <w:rPr>
+          <w:rFonts w:ascii="Times New Roman" w:hAnsi="Times New Roman" w:eastAsia="Times New Roman"/>
+          <w:b w:val="0"/>
+          <w:i w:val="0"/>
+          <w:color w:val="000000"/>
+          <w:sz w:val="19"/>
+          <w:u w:val="none"/>
+        </w:rPr>
+        <w:tab/>
+        <w:t>Professionnel (TOEIC 955/990)</w:t>
       </w:r>
     </w:p>
     <w:p>
       <w:pPr>
-        <w:spacing w:before="140" w:after="60" w:line="240" w:lineRule="auto"/>
+        <w:keepNext w:val="0"/>
+        <w:tabs>
+          <w:tab w:pos="1814" w:val="left"/>
+          <w:tab w:pos="3798" w:val="left"/>
+        </w:tabs>
+        <w:spacing w:before="0" w:after="20" w:line="240" w:lineRule="auto"/>
+        <w:ind w:left="3798" w:hanging="3798"/>
+      </w:pPr>
+      <w:r>
+        <w:rPr>
+          <w:rFonts w:ascii="Times New Roman" w:hAnsi="Times New Roman" w:eastAsia="Times New Roman"/>
+          <w:b w:val="0"/>
+          <w:i w:val="0"/>
+          <w:color w:val="000000"/>
+          <w:sz w:val="19"/>
+          <w:u w:val="none"/>
+        </w:rPr>
+      </w:r>
+      <w:r>
+        <w:rPr>
+          <w:rFonts w:ascii="Times New Roman" w:hAnsi="Times New Roman" w:eastAsia="Times New Roman"/>
+          <w:b w:val="0"/>
+          <w:i w:val="0"/>
+          <w:color w:val="000000"/>
+          <w:sz w:val="19"/>
+          <w:u w:val="none"/>
+        </w:rPr>
+        <w:tab/>
+      </w:r>
+      <w:r>
+        <w:rPr>
+          <w:rFonts w:ascii="Times New Roman" w:hAnsi="Times New Roman" w:eastAsia="Times New Roman"/>
+          <w:b/>
+          <w:i w:val="0"/>
+          <w:color w:val="000000"/>
+          <w:sz w:val="19"/>
+          <w:u w:val="none"/>
+        </w:rPr>
+        <w:t>Français</w:t>
+      </w:r>
+      <w:r>
+        <w:rPr>
+          <w:rFonts w:ascii="Times New Roman" w:hAnsi="Times New Roman" w:eastAsia="Times New Roman"/>
+          <w:b w:val="0"/>
+          <w:i w:val="0"/>
+          <w:color w:val="000000"/>
+          <w:sz w:val="19"/>
+          <w:u w:val="none"/>
+        </w:rPr>
+        <w:tab/>
+        <w:t>Bilingue</w:t>
+      </w:r>
+    </w:p>
+    <w:p>
+      <w:pPr>
+        <w:keepNext w:val="0"/>
+        <w:tabs>
+          <w:tab w:pos="1814" w:val="left"/>
+          <w:tab w:pos="3798" w:val="left"/>
+        </w:tabs>
+        <w:spacing w:before="0" w:after="20" w:line="240" w:lineRule="auto"/>
+        <w:ind w:left="3798" w:hanging="3798"/>
+      </w:pPr>
+      <w:r>
+        <w:rPr>
+          <w:rFonts w:ascii="Times New Roman" w:hAnsi="Times New Roman" w:eastAsia="Times New Roman"/>
+          <w:b w:val="0"/>
+          <w:i w:val="0"/>
+          <w:color w:val="000000"/>
+          <w:sz w:val="19"/>
+          <w:u w:val="none"/>
+        </w:rPr>
+      </w:r>
+      <w:r>
+        <w:rPr>
+          <w:rFonts w:ascii="Times New Roman" w:hAnsi="Times New Roman" w:eastAsia="Times New Roman"/>
+          <w:b w:val="0"/>
+          <w:i w:val="0"/>
+          <w:color w:val="000000"/>
+          <w:sz w:val="19"/>
+          <w:u w:val="none"/>
+        </w:rPr>
+        <w:tab/>
+      </w:r>
+      <w:r>
+        <w:rPr>
+          <w:rFonts w:ascii="Times New Roman" w:hAnsi="Times New Roman" w:eastAsia="Times New Roman"/>
+          <w:b/>
+          <w:i w:val="0"/>
+          <w:color w:val="000000"/>
+          <w:sz w:val="19"/>
+          <w:u w:val="none"/>
+        </w:rPr>
+        <w:t>Chinois</w:t>
+      </w:r>
+      <w:r>
+        <w:rPr>
+          <w:rFonts w:ascii="Times New Roman" w:hAnsi="Times New Roman" w:eastAsia="Times New Roman"/>
+          <w:b w:val="0"/>
+          <w:i w:val="0"/>
+          <w:color w:val="000000"/>
+          <w:sz w:val="19"/>
+          <w:u w:val="none"/>
+        </w:rPr>
+        <w:tab/>
+        <w:t>Langue maternelle</w:t>
+      </w:r>
+    </w:p>
+    <w:p>
+      <w:pPr>
+        <w:keepNext w:val="0"/>
+        <w:spacing w:before="60" w:after="80" w:line="24" w:lineRule="auto"/>
+        <w:ind w:right="8391"/>
         <w:pBdr>
-          <w:bottom w:val="single" w:sz="6" w:space="1" w:color="1F3A5F"/>
+          <w:bottom w:val="single" w:sz="4" w:space="1" w:color="A6A6A6"/>
         </w:pBdr>
       </w:pPr>
       <w:r>
         <w:rPr>
-          <w:rFonts w:ascii="Arial" w:hAnsi="Arial" w:eastAsia="Arial"/>
-          <w:b/>
+          <w:rFonts w:ascii="Times New Roman" w:hAnsi="Times New Roman" w:eastAsia="Times New Roman"/>
+          <w:b w:val="0"/>
           <w:i w:val="0"/>
-          <w:color w:val="1F3A5F"/>
-          <w:sz w:val="21"/>
+          <w:color w:val="000000"/>
+          <w:sz w:val="4"/>
+          <w:u w:val="none"/>
         </w:rPr>
-        <w:t>CENTRES D'INTÉRÊT</w:t>
       </w:r>
     </w:p>
     <w:p>
       <w:pPr>
+        <w:keepNext w:val="0"/>
+        <w:tabs>
+          <w:tab w:pos="3798" w:val="left"/>
+        </w:tabs>
         <w:spacing w:before="0" w:after="0" w:line="240" w:lineRule="auto"/>
+        <w:ind w:left="3798" w:hanging="3798"/>
       </w:pPr>
       <w:r>
         <w:rPr>
-          <w:rFonts w:ascii="Arial" w:hAnsi="Arial" w:eastAsia="Arial"/>
+          <w:rFonts w:ascii="Times New Roman" w:hAnsi="Times New Roman" w:eastAsia="Times New Roman"/>
           <w:b w:val="0"/>
           <w:i w:val="0"/>
+          <w:color w:val="000000"/>
           <w:sz w:val="19"/>
+          <w:u w:val="none"/>
         </w:rPr>
-        <w:t>Sport (crossfit, natation), voyages (18 pays visités), engagement associatif pour la protection animale</w:t>
+        <w:t>CENTRES D'INTÉRÊT</w:t>
+        <w:tab/>
+        <w:t>Sport (crossfit, natation), voyages (18 pays visités), engagement associatif (protection animale)</w:t>
       </w:r>
     </w:p>
     <w:sectPr>
       <w:pgSz w:w="11906" w:h="16838"/>
-      <w:pgMar w:top="680" w:right="794" w:bottom="680" w:left="794" w:header="720" w:footer="720" w:gutter="0"/>
+      <w:pgMar w:top="567" w:right="850" w:bottom="397" w:left="850" w:header="720" w:footer="720" w:gutter="0"/>
       <w:cols w:space="720"/>
       <w:docGrid w:linePitch="360"/>
     </w:sectPr>
@@ -1483,7 +2142,7 @@
     <w:qFormat/>
     <w:rsid w:val="00FC693F"/>
     <w:rPr>
-      <w:rFonts w:ascii="Arial" w:hAnsi="Arial"/>
+      <w:rFonts w:ascii="Times New Roman" w:hAnsi="Times New Roman"/>
       <w:sz w:val="19"/>
     </w:rPr>
   </w:style>

</xml_diff>

<commit_message>
CV général : title en avant, en-tête épuré, compétences resserrées
- Title (métier + spécialisation) au-dessus du nom, plus grand
- Bloc texte de l'en-tête calé sur la largeur du title, photo seule à droite
- Profil en 3 lignes, Louis Vuitton en une phrase
- Compétences sur 4 lignes (méthodologies intégrées à la gestion de projet)

Co-Authored-By: Claude Opus 5.5 <noreply@anthropic.com>
Claude-Session: https://claude.ai/code/session_01Uwm2tAGtUGTnWWMUSVQkub
</commit_message>
<xml_diff>
--- a/output/CV_NicolasQiGUO_General.docx
+++ b/output/CV_NicolasQiGUO_General.docx
@@ -5,8 +5,8 @@
     <w:p>
       <w:pPr>
         <w:keepNext w:val="0"/>
-        <w:spacing w:before="0" w:after="120" w:line="240" w:lineRule="auto"/>
-        <w:ind w:left="680"/>
+        <w:spacing w:before="0" w:after="0" w:line="240" w:lineRule="auto"/>
+        <w:ind w:left="0" w:right="3638"/>
       </w:pPr>
       <w:r>
         <w:drawing>
@@ -16,9 +16,9 @@
               <wp:align>right</wp:align>
             </wp:positionH>
             <wp:positionV relativeFrom="paragraph">
-              <wp:posOffset>18000</wp:posOffset>
+              <wp:posOffset>36000</wp:posOffset>
             </wp:positionV>
-            <wp:extent cx="1260000" cy="835882"/>
+            <wp:extent cx="1800000" cy="1194118"/>
             <wp:effectExtent l="0" t="0" r="0" b="0"/>
             <wp:wrapSquare wrapText="bothSides"/>
             <wp:docPr id="1" name="Picture 1"/>
@@ -41,7 +41,7 @@
                   <pic:spPr>
                     <a:xfrm>
                       <a:off x="0" y="0"/>
-                      <a:ext cx="1260000" cy="835882"/>
+                      <a:ext cx="1800000" cy="1194118"/>
                     </a:xfrm>
                     <a:prstGeom prst="rect"/>
                   </pic:spPr>
@@ -57,8 +57,44 @@
           <w:b/>
           <w:i w:val="0"/>
           <w:color w:val="000000"/>
-          <w:sz w:val="30"/>
-          <w:u w:val="single"/>
+          <w:sz w:val="34"/>
+          <w:u w:val="none"/>
+        </w:rPr>
+        <w:t>CHEF DE PROJET SI</w:t>
+      </w:r>
+    </w:p>
+    <w:p>
+      <w:pPr>
+        <w:keepNext w:val="0"/>
+        <w:spacing w:before="0" w:after="140" w:line="240" w:lineRule="auto"/>
+        <w:ind w:left="0" w:right="3638"/>
+      </w:pPr>
+      <w:r>
+        <w:rPr>
+          <w:rFonts w:ascii="Times New Roman" w:hAnsi="Times New Roman" w:eastAsia="Times New Roman"/>
+          <w:b/>
+          <w:i w:val="0"/>
+          <w:color w:val="000000"/>
+          <w:sz w:val="24"/>
+          <w:u w:val="none"/>
+        </w:rPr>
+        <w:t>TRANSFORMATION DIGITALE, IA &amp; AUTOMATISATION</w:t>
+      </w:r>
+    </w:p>
+    <w:p>
+      <w:pPr>
+        <w:keepNext w:val="0"/>
+        <w:spacing w:before="0" w:after="20" w:line="240" w:lineRule="auto"/>
+        <w:ind w:left="0" w:right="3638"/>
+      </w:pPr>
+      <w:r>
+        <w:rPr>
+          <w:rFonts w:ascii="Times New Roman" w:hAnsi="Times New Roman" w:eastAsia="Times New Roman"/>
+          <w:b/>
+          <w:i w:val="0"/>
+          <w:color w:val="000000"/>
+          <w:sz w:val="22"/>
+          <w:u w:val="none"/>
         </w:rPr>
         <w:t>NICOLAS QI GUO</w:t>
       </w:r>
@@ -66,8 +102,45 @@
     <w:p>
       <w:pPr>
         <w:keepNext w:val="0"/>
-        <w:spacing w:before="0" w:after="80" w:line="240" w:lineRule="auto"/>
-        <w:ind w:left="680"/>
+        <w:spacing w:before="0" w:after="0" w:line="240" w:lineRule="auto"/>
+        <w:ind w:left="0" w:right="3638"/>
+      </w:pPr>
+      <w:r>
+        <w:rPr>
+          <w:rFonts w:ascii="Times New Roman" w:hAnsi="Times New Roman" w:eastAsia="Times New Roman"/>
+          <w:b w:val="0"/>
+          <w:i w:val="0"/>
+          <w:color w:val="000000"/>
+          <w:sz w:val="18"/>
+          <w:u w:val="none"/>
+        </w:rPr>
+        <w:t>Orléans, France | Mobilité Île-de-France</w:t>
+      </w:r>
+    </w:p>
+    <w:p>
+      <w:pPr>
+        <w:keepNext w:val="0"/>
+        <w:spacing w:before="0" w:after="0" w:line="240" w:lineRule="auto"/>
+        <w:ind w:left="0" w:right="3638"/>
+      </w:pPr>
+      <w:r>
+        <w:rPr>
+          <w:rFonts w:ascii="Times New Roman" w:hAnsi="Times New Roman" w:eastAsia="Times New Roman"/>
+          <w:b w:val="0"/>
+          <w:i w:val="0"/>
+          <w:color w:val="000000"/>
+          <w:sz w:val="18"/>
+          <w:u w:val="none"/>
+        </w:rPr>
+        <w:t>+33 6 30 23 24 41 | qi.guo@essec.edu</w:t>
+      </w:r>
+    </w:p>
+    <w:p>
+      <w:pPr>
+        <w:keepNext w:val="0"/>
+        <w:spacing w:before="140" w:after="0" w:line="240" w:lineRule="auto"/>
+        <w:ind w:left="0" w:right="3638"/>
+        <w:jc w:val="both"/>
       </w:pPr>
       <w:r>
         <w:rPr>
@@ -78,15 +151,8 @@
           <w:sz w:val="19"/>
           <w:u w:val="none"/>
         </w:rPr>
-        <w:t>CHEF DE PROJET SI | TRANSFORMATION DIGITALE, IA &amp; AUTOMATISATION</w:t>
+        <w:t xml:space="preserve">Profil : </w:t>
       </w:r>
-    </w:p>
-    <w:p>
-      <w:pPr>
-        <w:keepNext w:val="0"/>
-        <w:spacing w:before="0" w:after="0" w:line="240" w:lineRule="auto"/>
-        <w:ind w:left="680"/>
-      </w:pPr>
       <w:r>
         <w:rPr>
           <w:rFonts w:ascii="Times New Roman" w:hAnsi="Times New Roman" w:eastAsia="Times New Roman"/>
@@ -96,67 +162,13 @@
           <w:sz w:val="19"/>
           <w:u w:val="none"/>
         </w:rPr>
-        <w:t>Orléans, France | Mobilité Île-de-France</w:t>
+        <w:t>Chef de projet SI, 3 ans d'expérience chez BNP Paribas et La Poste Groupe. Pilotage de projets IA (GenAI, RAG, Copilot) et d'automatisation (RPA, Power Platform), du besoin à la mise en production, et conduite du changement.</w:t>
       </w:r>
     </w:p>
     <w:p>
       <w:pPr>
         <w:keepNext w:val="0"/>
-        <w:spacing w:before="0" w:after="0" w:line="240" w:lineRule="auto"/>
-        <w:ind w:left="680"/>
-      </w:pPr>
-      <w:r>
-        <w:rPr>
-          <w:rFonts w:ascii="Times New Roman" w:hAnsi="Times New Roman" w:eastAsia="Times New Roman"/>
-          <w:b w:val="0"/>
-          <w:i w:val="0"/>
-          <w:color w:val="000000"/>
-          <w:sz w:val="19"/>
-          <w:u w:val="none"/>
-        </w:rPr>
-        <w:t>Tél. : +33 6 30 23 24 41 | E-mail : qi.guo@essec.edu</w:t>
-      </w:r>
-    </w:p>
-    <w:p>
-      <w:pPr>
-        <w:keepNext w:val="0"/>
-        <w:spacing w:before="120" w:after="0" w:line="240" w:lineRule="auto"/>
-        <w:ind w:left="680"/>
-      </w:pPr>
-      <w:r>
-        <w:rPr>
-          <w:rFonts w:ascii="Times New Roman" w:hAnsi="Times New Roman" w:eastAsia="Times New Roman"/>
-          <w:b/>
-          <w:i w:val="0"/>
-          <w:color w:val="000000"/>
-          <w:sz w:val="19"/>
-          <w:u w:val="none"/>
-        </w:rPr>
-        <w:t>PROFIL</w:t>
-      </w:r>
-    </w:p>
-    <w:p>
-      <w:pPr>
-        <w:keepNext w:val="0"/>
-        <w:spacing w:before="0" w:after="0" w:line="240" w:lineRule="auto"/>
-        <w:ind w:left="680"/>
-      </w:pPr>
-      <w:r>
-        <w:rPr>
-          <w:rFonts w:ascii="Times New Roman" w:hAnsi="Times New Roman" w:eastAsia="Times New Roman"/>
-          <w:b w:val="0"/>
-          <w:i w:val="0"/>
-          <w:color w:val="000000"/>
-          <w:sz w:val="19"/>
-          <w:u w:val="none"/>
-        </w:rPr>
-        <w:t>Chef de projet SI, 3 ans d'expérience en transformation digitale chez BNP Paribas et La Poste Groupe. Pilotage de projets IA (GenAI, RAG, Copilot) et d'automatisation (RPA, Power Platform), du recueil des besoins à la mise en production, gouvernance projet et conduite du changement.</w:t>
-      </w:r>
-    </w:p>
-    <w:p>
-      <w:pPr>
-        <w:keepNext w:val="0"/>
-        <w:spacing w:before="100" w:after="100" w:line="24" w:lineRule="auto"/>
+        <w:spacing w:before="160" w:after="140" w:line="24" w:lineRule="auto"/>
         <w:pBdr>
           <w:bottom w:val="single" w:sz="4" w:space="1" w:color="A6A6A6"/>
         </w:pBdr>
@@ -418,7 +430,7 @@
           <w:tab w:pos="822" w:val="center"/>
           <w:tab w:pos="1814" w:val="left"/>
         </w:tabs>
-        <w:spacing w:before="120" w:after="0" w:line="240" w:lineRule="auto"/>
+        <w:spacing w:before="180" w:after="0" w:line="240" w:lineRule="auto"/>
         <w:ind w:left="1814" w:hanging="1814"/>
       </w:pPr>
       <w:r>
@@ -838,7 +850,7 @@
           <w:tab w:pos="822" w:val="center"/>
           <w:tab w:pos="1814" w:val="left"/>
         </w:tabs>
-        <w:spacing w:before="120" w:after="40" w:line="240" w:lineRule="auto"/>
+        <w:spacing w:before="180" w:after="40" w:line="240" w:lineRule="auto"/>
         <w:ind w:left="1814" w:hanging="1814"/>
       </w:pPr>
       <w:r>
@@ -896,46 +908,13 @@
           <w:sz w:val="19"/>
           <w:u w:val="none"/>
         </w:rPr>
-        <w:t>Gestion d'une clientèle VIP internationale dans un environnement exigeant</w:t>
+        <w:t>Gestion d'une clientèle VIP internationale : sens du service et adaptation en contexte multiculturel</w:t>
       </w:r>
     </w:p>
     <w:p>
       <w:pPr>
         <w:keepNext w:val="0"/>
-        <w:tabs>
-          <w:tab w:pos="2069" w:val="left"/>
-        </w:tabs>
-        <w:spacing w:before="0" w:after="40" w:line="240" w:lineRule="auto"/>
-        <w:ind w:left="2069" w:hanging="227"/>
-      </w:pPr>
-      <w:r>
-        <w:rPr>
-          <w:rFonts w:ascii="Times New Roman" w:hAnsi="Times New Roman" w:eastAsia="Times New Roman"/>
-          <w:b w:val="0"/>
-          <w:i w:val="0"/>
-          <w:color w:val="000000"/>
-          <w:sz w:val="19"/>
-          <w:u w:val="none"/>
-        </w:rPr>
-        <w:t>•</w:t>
-        <w:tab/>
-      </w:r>
-      <w:r>
-        <w:rPr>
-          <w:rFonts w:ascii="Times New Roman" w:hAnsi="Times New Roman" w:eastAsia="Times New Roman"/>
-          <w:b w:val="0"/>
-          <w:i w:val="0"/>
-          <w:color w:val="000000"/>
-          <w:sz w:val="19"/>
-          <w:u w:val="none"/>
-        </w:rPr>
-        <w:t>Sens du service, communication et adaptation en contexte multiculturel</w:t>
-      </w:r>
-    </w:p>
-    <w:p>
-      <w:pPr>
-        <w:keepNext w:val="0"/>
-        <w:spacing w:before="60" w:after="80" w:line="24" w:lineRule="auto"/>
+        <w:spacing w:before="140" w:after="120" w:line="24" w:lineRule="auto"/>
         <w:ind w:right="8391"/>
         <w:pBdr>
           <w:bottom w:val="single" w:sz="4" w:space="1" w:color="A6A6A6"/>
@@ -1191,7 +1170,7 @@
     <w:p>
       <w:pPr>
         <w:keepNext w:val="0"/>
-        <w:spacing w:before="60" w:after="80" w:line="24" w:lineRule="auto"/>
+        <w:spacing w:before="140" w:after="120" w:line="24" w:lineRule="auto"/>
         <w:ind w:right="8391"/>
         <w:pBdr>
           <w:bottom w:val="single" w:sz="4" w:space="1" w:color="A6A6A6"/>
@@ -1213,10 +1192,10 @@
         <w:keepNext w:val="0"/>
         <w:tabs>
           <w:tab w:pos="1814" w:val="left"/>
-          <w:tab w:pos="3798" w:val="left"/>
+          <w:tab w:pos="3685" w:val="left"/>
         </w:tabs>
         <w:spacing w:before="0" w:after="40" w:line="240" w:lineRule="auto"/>
-        <w:ind w:left="3798" w:hanging="3798"/>
+        <w:ind w:left="3685" w:hanging="3685"/>
       </w:pPr>
       <w:r>
         <w:rPr>
@@ -1261,7 +1240,7 @@
           <w:u w:val="none"/>
         </w:rPr>
         <w:tab/>
-        <w:t>cadrage, recueil des besoins, spécifications fonctionnelles, coordination métiers / IT, recette, mise en production, gestion des risques, COPIL / COSUI</w:t>
+        <w:t>Cycle en V, Agile, hybride – cadrage, recette, mise en production, COPIL / COSUI</w:t>
       </w:r>
     </w:p>
     <w:p>
@@ -1269,120 +1248,10 @@
         <w:keepNext w:val="0"/>
         <w:tabs>
           <w:tab w:pos="1814" w:val="left"/>
-          <w:tab w:pos="3798" w:val="left"/>
+          <w:tab w:pos="3685" w:val="left"/>
         </w:tabs>
         <w:spacing w:before="0" w:after="40" w:line="240" w:lineRule="auto"/>
-        <w:ind w:left="3798" w:hanging="3798"/>
-      </w:pPr>
-      <w:r>
-        <w:rPr>
-          <w:rFonts w:ascii="Times New Roman" w:hAnsi="Times New Roman" w:eastAsia="Times New Roman"/>
-          <w:b w:val="0"/>
-          <w:i w:val="0"/>
-          <w:color w:val="000000"/>
-          <w:sz w:val="19"/>
-          <w:u w:val="none"/>
-        </w:rPr>
-      </w:r>
-      <w:r>
-        <w:rPr>
-          <w:rFonts w:ascii="Times New Roman" w:hAnsi="Times New Roman" w:eastAsia="Times New Roman"/>
-          <w:b w:val="0"/>
-          <w:i w:val="0"/>
-          <w:color w:val="000000"/>
-          <w:sz w:val="19"/>
-          <w:u w:val="none"/>
-        </w:rPr>
-        <w:tab/>
-      </w:r>
-      <w:r>
-        <w:rPr>
-          <w:rFonts w:ascii="Times New Roman" w:hAnsi="Times New Roman" w:eastAsia="Times New Roman"/>
-          <w:b/>
-          <w:i w:val="0"/>
-          <w:color w:val="000000"/>
-          <w:sz w:val="19"/>
-          <w:u w:val="none"/>
-        </w:rPr>
-        <w:t>Méthodologies :</w:t>
-      </w:r>
-      <w:r>
-        <w:rPr>
-          <w:rFonts w:ascii="Times New Roman" w:hAnsi="Times New Roman" w:eastAsia="Times New Roman"/>
-          <w:b w:val="0"/>
-          <w:i w:val="0"/>
-          <w:color w:val="000000"/>
-          <w:sz w:val="19"/>
-          <w:u w:val="none"/>
-        </w:rPr>
-        <w:tab/>
-        <w:t>Cycle en V, Agile, hybride</w:t>
-      </w:r>
-    </w:p>
-    <w:p>
-      <w:pPr>
-        <w:keepNext w:val="0"/>
-        <w:tabs>
-          <w:tab w:pos="1814" w:val="left"/>
-          <w:tab w:pos="3798" w:val="left"/>
-        </w:tabs>
-        <w:spacing w:before="0" w:after="40" w:line="240" w:lineRule="auto"/>
-        <w:ind w:left="3798" w:hanging="3798"/>
-      </w:pPr>
-      <w:r>
-        <w:rPr>
-          <w:rFonts w:ascii="Times New Roman" w:hAnsi="Times New Roman" w:eastAsia="Times New Roman"/>
-          <w:b w:val="0"/>
-          <w:i w:val="0"/>
-          <w:color w:val="000000"/>
-          <w:sz w:val="19"/>
-          <w:u w:val="none"/>
-        </w:rPr>
-      </w:r>
-      <w:r>
-        <w:rPr>
-          <w:rFonts w:ascii="Times New Roman" w:hAnsi="Times New Roman" w:eastAsia="Times New Roman"/>
-          <w:b w:val="0"/>
-          <w:i w:val="0"/>
-          <w:color w:val="000000"/>
-          <w:sz w:val="19"/>
-          <w:u w:val="none"/>
-        </w:rPr>
-        <w:tab/>
-      </w:r>
-      <w:r>
-        <w:rPr>
-          <w:rFonts w:ascii="Times New Roman" w:hAnsi="Times New Roman" w:eastAsia="Times New Roman"/>
-          <w:b/>
-          <w:i w:val="0"/>
-          <w:color w:val="000000"/>
-          <w:sz w:val="19"/>
-          <w:u w:val="none"/>
-        </w:rPr>
-        <w:t>Transformation &amp; IA :</w:t>
-      </w:r>
-      <w:r>
-        <w:rPr>
-          <w:rFonts w:ascii="Times New Roman" w:hAnsi="Times New Roman" w:eastAsia="Times New Roman"/>
-          <w:b w:val="0"/>
-          <w:i w:val="0"/>
-          <w:color w:val="000000"/>
-          <w:sz w:val="19"/>
-          <w:u w:val="none"/>
-        </w:rPr>
-        <w:tab/>
-        <w:t>GenAI, RAG, Copilot, RPA, POC, use cases, ROI, conduite du changement</w:t>
-      </w:r>
-    </w:p>
-    <w:p>
-      <w:pPr>
-        <w:keepNext w:val="0"/>
-        <w:tabs>
-          <w:tab w:pos="1814" w:val="left"/>
-          <w:tab w:pos="3798" w:val="left"/>
-        </w:tabs>
-        <w:spacing w:before="0" w:after="40" w:line="240" w:lineRule="auto"/>
-        <w:ind w:left="3798" w:hanging="3798"/>
+        <w:ind w:left="3685" w:hanging="3685"/>
       </w:pPr>
       <w:r>
         <w:rPr>
@@ -1426,7 +1295,7 @@
           <w:u w:val="none"/>
         </w:rPr>
         <w:tab/>
-        <w:t>SI Finance, SIRH, SAP, intégration, sécurité, conformité, gouvernance SI</w:t>
+        <w:t>SI Finance, SAP, intégration applicative, sécurité, conformité et gouvernance des SI</w:t>
       </w:r>
     </w:p>
     <w:p>
@@ -1434,10 +1303,10 @@
         <w:keepNext w:val="0"/>
         <w:tabs>
           <w:tab w:pos="1814" w:val="left"/>
-          <w:tab w:pos="3798" w:val="left"/>
+          <w:tab w:pos="3685" w:val="left"/>
         </w:tabs>
         <w:spacing w:before="0" w:after="40" w:line="240" w:lineRule="auto"/>
-        <w:ind w:left="3798" w:hanging="3798"/>
+        <w:ind w:left="3685" w:hanging="3685"/>
       </w:pPr>
       <w:r>
         <w:rPr>
@@ -1469,7 +1338,7 @@
           <w:sz w:val="19"/>
           <w:u w:val="none"/>
         </w:rPr>
-        <w:t>Outils :</w:t>
+        <w:t>Outils digitaux :</w:t>
       </w:r>
       <w:r>
         <w:rPr>
@@ -1489,10 +1358,10 @@
         <w:keepNext w:val="0"/>
         <w:tabs>
           <w:tab w:pos="1814" w:val="left"/>
-          <w:tab w:pos="3798" w:val="left"/>
+          <w:tab w:pos="3685" w:val="left"/>
         </w:tabs>
         <w:spacing w:before="0" w:after="40" w:line="240" w:lineRule="auto"/>
-        <w:ind w:left="3798" w:hanging="3798"/>
+        <w:ind w:left="3685" w:hanging="3685"/>
       </w:pPr>
       <w:r>
         <w:rPr>
@@ -1536,13 +1405,13 @@
           <w:u w:val="none"/>
         </w:rPr>
         <w:tab/>
-        <w:t>Python, SQL, Java, PHP, C, C#, HTML/CSS</w:t>
+        <w:t>Python, SQL, Java, PHP, HTML/CSS, C, C#</w:t>
       </w:r>
     </w:p>
     <w:p>
       <w:pPr>
         <w:keepNext w:val="0"/>
-        <w:spacing w:before="60" w:after="80" w:line="24" w:lineRule="auto"/>
+        <w:spacing w:before="140" w:after="120" w:line="24" w:lineRule="auto"/>
         <w:ind w:right="8391"/>
         <w:pBdr>
           <w:bottom w:val="single" w:sz="4" w:space="1" w:color="A6A6A6"/>
@@ -1564,10 +1433,10 @@
         <w:keepNext w:val="0"/>
         <w:tabs>
           <w:tab w:pos="1814" w:val="left"/>
-          <w:tab w:pos="3798" w:val="left"/>
+          <w:tab w:pos="3685" w:val="left"/>
         </w:tabs>
         <w:spacing w:before="0" w:after="20" w:line="240" w:lineRule="auto"/>
-        <w:ind w:left="3798" w:hanging="3798"/>
+        <w:ind w:left="3685" w:hanging="3685"/>
       </w:pPr>
       <w:r>
         <w:rPr>
@@ -1620,10 +1489,10 @@
         <w:keepNext w:val="0"/>
         <w:tabs>
           <w:tab w:pos="1814" w:val="left"/>
-          <w:tab w:pos="3798" w:val="left"/>
+          <w:tab w:pos="3685" w:val="left"/>
         </w:tabs>
         <w:spacing w:before="0" w:after="20" w:line="240" w:lineRule="auto"/>
-        <w:ind w:left="3798" w:hanging="3798"/>
+        <w:ind w:left="3685" w:hanging="3685"/>
       </w:pPr>
       <w:r>
         <w:rPr>
@@ -1675,10 +1544,10 @@
         <w:keepNext w:val="0"/>
         <w:tabs>
           <w:tab w:pos="1814" w:val="left"/>
-          <w:tab w:pos="3798" w:val="left"/>
+          <w:tab w:pos="3685" w:val="left"/>
         </w:tabs>
         <w:spacing w:before="0" w:after="20" w:line="240" w:lineRule="auto"/>
-        <w:ind w:left="3798" w:hanging="3798"/>
+        <w:ind w:left="3685" w:hanging="3685"/>
       </w:pPr>
       <w:r>
         <w:rPr>
@@ -1728,7 +1597,7 @@
     <w:p>
       <w:pPr>
         <w:keepNext w:val="0"/>
-        <w:spacing w:before="60" w:after="80" w:line="24" w:lineRule="auto"/>
+        <w:spacing w:before="140" w:after="120" w:line="24" w:lineRule="auto"/>
         <w:ind w:right="8391"/>
         <w:pBdr>
           <w:bottom w:val="single" w:sz="4" w:space="1" w:color="A6A6A6"/>
@@ -1749,10 +1618,10 @@
       <w:pPr>
         <w:keepNext w:val="0"/>
         <w:tabs>
-          <w:tab w:pos="3798" w:val="left"/>
+          <w:tab w:pos="3685" w:val="left"/>
         </w:tabs>
         <w:spacing w:before="0" w:after="0" w:line="240" w:lineRule="auto"/>
-        <w:ind w:left="3798" w:hanging="3798"/>
+        <w:ind w:left="3685" w:hanging="3685"/>
       </w:pPr>
       <w:r>
         <w:rPr>
@@ -1765,7 +1634,7 @@
         </w:rPr>
         <w:t>CENTRES D'INTÉRÊT</w:t>
         <w:tab/>
-        <w:t>Sport (crossfit, natation), voyages (18 pays visités), engagement associatif (protection animale)</w:t>
+        <w:t>Crossfit, natation, voyages (18 pays), engagement associatif (protection animale)</w:t>
       </w:r>
     </w:p>
     <w:sectPr>

</xml_diff>

<commit_message>
CV général : title sur une ligne, profil enrichi, gestion de projet restructurée
Co-Authored-By: Claude Opus 5.5 <noreply@anthropic.com>
Claude-Session: https://claude.ai/code/session_01Uwm2tAGtUGTnWWMUSVQkub
</commit_message>
<xml_diff>
--- a/output/CV_NicolasQiGUO_General.docx
+++ b/output/CV_NicolasQiGUO_General.docx
@@ -6,7 +6,7 @@
       <w:pPr>
         <w:keepNext w:val="0"/>
         <w:spacing w:before="0" w:after="0" w:line="240" w:lineRule="auto"/>
-        <w:ind w:left="0" w:right="3638"/>
+        <w:ind w:left="0" w:right="2727"/>
       </w:pPr>
       <w:r>
         <w:drawing>
@@ -18,7 +18,7 @@
             <wp:positionV relativeFrom="paragraph">
               <wp:posOffset>36000</wp:posOffset>
             </wp:positionV>
-            <wp:extent cx="1800000" cy="1194118"/>
+            <wp:extent cx="1584000" cy="1050824"/>
             <wp:effectExtent l="0" t="0" r="0" b="0"/>
             <wp:wrapSquare wrapText="bothSides"/>
             <wp:docPr id="1" name="Picture 1"/>
@@ -41,7 +41,7 @@
                   <pic:spPr>
                     <a:xfrm>
                       <a:off x="0" y="0"/>
-                      <a:ext cx="1800000" cy="1194118"/>
+                      <a:ext cx="1584000" cy="1050824"/>
                     </a:xfrm>
                     <a:prstGeom prst="rect"/>
                   </pic:spPr>
@@ -57,17 +57,17 @@
           <w:b/>
           <w:i w:val="0"/>
           <w:color w:val="000000"/>
-          <w:sz w:val="34"/>
+          <w:sz w:val="23"/>
           <w:u w:val="none"/>
         </w:rPr>
-        <w:t>CHEF DE PROJET SI</w:t>
+        <w:t>CHEF DE PROJET SI | TRANSFORMATION IA &amp; AUTOMATISATION</w:t>
       </w:r>
     </w:p>
     <w:p>
       <w:pPr>
         <w:keepNext w:val="0"/>
-        <w:spacing w:before="0" w:after="140" w:line="240" w:lineRule="auto"/>
-        <w:ind w:left="0" w:right="3638"/>
+        <w:spacing w:before="120" w:after="20" w:line="240" w:lineRule="auto"/>
+        <w:ind w:left="0" w:right="2727"/>
       </w:pPr>
       <w:r>
         <w:rPr>
@@ -75,25 +75,7 @@
           <w:b/>
           <w:i w:val="0"/>
           <w:color w:val="000000"/>
-          <w:sz w:val="24"/>
-          <w:u w:val="none"/>
-        </w:rPr>
-        <w:t>TRANSFORMATION DIGITALE, IA &amp; AUTOMATISATION</w:t>
-      </w:r>
-    </w:p>
-    <w:p>
-      <w:pPr>
-        <w:keepNext w:val="0"/>
-        <w:spacing w:before="0" w:after="20" w:line="240" w:lineRule="auto"/>
-        <w:ind w:left="0" w:right="3638"/>
-      </w:pPr>
-      <w:r>
-        <w:rPr>
-          <w:rFonts w:ascii="Times New Roman" w:hAnsi="Times New Roman" w:eastAsia="Times New Roman"/>
-          <w:b/>
-          <w:i w:val="0"/>
-          <w:color w:val="000000"/>
-          <w:sz w:val="22"/>
+          <w:sz w:val="21"/>
           <w:u w:val="none"/>
         </w:rPr>
         <w:t>NICOLAS QI GUO</w:t>
@@ -103,7 +85,7 @@
       <w:pPr>
         <w:keepNext w:val="0"/>
         <w:spacing w:before="0" w:after="0" w:line="240" w:lineRule="auto"/>
-        <w:ind w:left="0" w:right="3638"/>
+        <w:ind w:left="0" w:right="2727"/>
       </w:pPr>
       <w:r>
         <w:rPr>
@@ -121,7 +103,7 @@
       <w:pPr>
         <w:keepNext w:val="0"/>
         <w:spacing w:before="0" w:after="0" w:line="240" w:lineRule="auto"/>
-        <w:ind w:left="0" w:right="3638"/>
+        <w:ind w:left="0" w:right="2727"/>
       </w:pPr>
       <w:r>
         <w:rPr>
@@ -139,7 +121,7 @@
       <w:pPr>
         <w:keepNext w:val="0"/>
         <w:spacing w:before="140" w:after="0" w:line="240" w:lineRule="auto"/>
-        <w:ind w:left="0" w:right="3638"/>
+        <w:ind w:left="0" w:right="2727"/>
         <w:jc w:val="both"/>
       </w:pPr>
       <w:r>
@@ -162,7 +144,7 @@
           <w:sz w:val="19"/>
           <w:u w:val="none"/>
         </w:rPr>
-        <w:t>Chef de projet SI, 3 ans d'expérience chez BNP Paribas et La Poste Groupe. Pilotage de projets IA (GenAI, RAG, Copilot) et d'automatisation (RPA, Power Platform), du besoin à la mise en production, et conduite du changement.</w:t>
+        <w:t>Chef de projet SI, 3 ans d'expérience en transformation digitale chez BNP Paribas et La Poste Groupe. Pilotage de projets IA (GenAI, RAG, Copilot) et d'automatisation (RPA, Power Platform), du besoin à la mise en production, gouvernance et conduite du changement.</w:t>
       </w:r>
     </w:p>
     <w:p>
@@ -1240,7 +1222,9 @@
           <w:u w:val="none"/>
         </w:rPr>
         <w:tab/>
-        <w:t>Cycle en V, Agile, hybride – cadrage, recette, mise en production, COPIL / COSUI</w:t>
+        <w:t>Pilotage de bout en bout : cadrage, recueil des besoins, recette, mise en production</w:t>
+        <w:br/>
+        <w:t>Gouvernance (COPIL / COSUI), gestion des risques – Cycle en V, Agile, hybride</w:t>
       </w:r>
     </w:p>
     <w:p>

</xml_diff>

<commit_message>
CV général V5 : profil plus sobre, conduite du changement BNP, respiration
Co-Authored-By: Claude Opus 5.5 <noreply@anthropic.com>
Claude-Session: https://claude.ai/code/session_01Uwm2tAGtUGTnWWMUSVQkub
</commit_message>
<xml_diff>
--- a/output/CV_NicolasQiGUO_General.docx
+++ b/output/CV_NicolasQiGUO_General.docx
@@ -144,7 +144,7 @@
           <w:sz w:val="19"/>
           <w:u w:val="none"/>
         </w:rPr>
-        <w:t>Chef de projet SI, 3 ans d'expérience en transformation digitale chez BNP Paribas et La Poste Groupe. Pilotage de projets IA (GenAI, RAG, Copilot) et d'automatisation (RPA, Power Platform), du besoin à la mise en production, gouvernance et conduite du changement.</w:t>
+        <w:t>Chef de projet SI avec 3 ans d'expérience en transformation digitale, spécialisé dans le pilotage de projets IA &amp; automatisation. Expérience de bout en bout, du cadrage à la mise en production, en coordination transverse Métiers–IT.</w:t>
       </w:r>
     </w:p>
     <w:p>
@@ -391,7 +391,7 @@
           <w:sz w:val="19"/>
           <w:u w:val="none"/>
         </w:rPr>
-        <w:t xml:space="preserve">Transformation digitale et conduite du changement : </w:t>
+        <w:t xml:space="preserve">Conduite du changement </w:t>
       </w:r>
       <w:r>
         <w:rPr>
@@ -402,7 +402,7 @@
           <w:sz w:val="19"/>
           <w:u w:val="none"/>
         </w:rPr>
-        <w:t>contribution au déploiement d'un programme IA à grande échelle (5 000+ collaborateurs), animation d'un réseau de 70+ ambassadeurs IA, sessions d'onboarding et d'acculturation, événements communautaires</w:t>
+        <w:t>dans le cadre du déploiement d'un programme IA à grande échelle (5 000+ collaborateurs) : animation d'un réseau de 70+ ambassadeurs IA, sessions d'onboarding et d'acculturation, événements communautaires</w:t>
       </w:r>
     </w:p>
     <w:p>
@@ -896,7 +896,7 @@
     <w:p>
       <w:pPr>
         <w:keepNext w:val="0"/>
-        <w:spacing w:before="140" w:after="120" w:line="24" w:lineRule="auto"/>
+        <w:spacing w:before="200" w:after="160" w:line="24" w:lineRule="auto"/>
         <w:ind w:right="8391"/>
         <w:pBdr>
           <w:bottom w:val="single" w:sz="4" w:space="1" w:color="A6A6A6"/>
@@ -1152,7 +1152,7 @@
     <w:p>
       <w:pPr>
         <w:keepNext w:val="0"/>
-        <w:spacing w:before="140" w:after="120" w:line="24" w:lineRule="auto"/>
+        <w:spacing w:before="200" w:after="160" w:line="24" w:lineRule="auto"/>
         <w:ind w:right="8391"/>
         <w:pBdr>
           <w:bottom w:val="single" w:sz="4" w:space="1" w:color="A6A6A6"/>
@@ -1395,7 +1395,7 @@
     <w:p>
       <w:pPr>
         <w:keepNext w:val="0"/>
-        <w:spacing w:before="140" w:after="120" w:line="24" w:lineRule="auto"/>
+        <w:spacing w:before="200" w:after="160" w:line="24" w:lineRule="auto"/>
         <w:ind w:right="8391"/>
         <w:pBdr>
           <w:bottom w:val="single" w:sz="4" w:space="1" w:color="A6A6A6"/>
@@ -1581,7 +1581,7 @@
     <w:p>
       <w:pPr>
         <w:keepNext w:val="0"/>
-        <w:spacing w:before="140" w:after="120" w:line="24" w:lineRule="auto"/>
+        <w:spacing w:before="200" w:after="160" w:line="24" w:lineRule="auto"/>
         <w:ind w:right="8391"/>
         <w:pBdr>
           <w:bottom w:val="single" w:sz="4" w:space="1" w:color="A6A6A6"/>

</xml_diff>

<commit_message>
CV général V6 : en-tête allégé (title plus petit, profil 2 lignes), sans doublon bout en bout
Co-Authored-By: Claude Opus 5.5 <noreply@anthropic.com>
Claude-Session: https://claude.ai/code/session_01Uwm2tAGtUGTnWWMUSVQkub
</commit_message>
<xml_diff>
--- a/output/CV_NicolasQiGUO_General.docx
+++ b/output/CV_NicolasQiGUO_General.docx
@@ -6,7 +6,7 @@
       <w:pPr>
         <w:keepNext w:val="0"/>
         <w:spacing w:before="0" w:after="0" w:line="240" w:lineRule="auto"/>
-        <w:ind w:left="0" w:right="2727"/>
+        <w:ind w:left="0" w:right="3375"/>
       </w:pPr>
       <w:r>
         <w:drawing>
@@ -57,7 +57,7 @@
           <w:b/>
           <w:i w:val="0"/>
           <w:color w:val="000000"/>
-          <w:sz w:val="23"/>
+          <w:sz w:val="21"/>
           <w:u w:val="none"/>
         </w:rPr>
         <w:t>CHEF DE PROJET SI | TRANSFORMATION IA &amp; AUTOMATISATION</w:t>
@@ -67,7 +67,7 @@
       <w:pPr>
         <w:keepNext w:val="0"/>
         <w:spacing w:before="120" w:after="20" w:line="240" w:lineRule="auto"/>
-        <w:ind w:left="0" w:right="2727"/>
+        <w:ind w:left="0" w:right="3375"/>
       </w:pPr>
       <w:r>
         <w:rPr>
@@ -75,7 +75,7 @@
           <w:b/>
           <w:i w:val="0"/>
           <w:color w:val="000000"/>
-          <w:sz w:val="21"/>
+          <w:sz w:val="20"/>
           <w:u w:val="none"/>
         </w:rPr>
         <w:t>NICOLAS QI GUO</w:t>
@@ -85,7 +85,7 @@
       <w:pPr>
         <w:keepNext w:val="0"/>
         <w:spacing w:before="0" w:after="0" w:line="240" w:lineRule="auto"/>
-        <w:ind w:left="0" w:right="2727"/>
+        <w:ind w:left="0" w:right="3375"/>
       </w:pPr>
       <w:r>
         <w:rPr>
@@ -103,7 +103,7 @@
       <w:pPr>
         <w:keepNext w:val="0"/>
         <w:spacing w:before="0" w:after="0" w:line="240" w:lineRule="auto"/>
-        <w:ind w:left="0" w:right="2727"/>
+        <w:ind w:left="0" w:right="3375"/>
       </w:pPr>
       <w:r>
         <w:rPr>
@@ -121,7 +121,7 @@
       <w:pPr>
         <w:keepNext w:val="0"/>
         <w:spacing w:before="140" w:after="0" w:line="240" w:lineRule="auto"/>
-        <w:ind w:left="0" w:right="2727"/>
+        <w:ind w:left="0" w:right="3375"/>
         <w:jc w:val="both"/>
       </w:pPr>
       <w:r>
@@ -144,7 +144,7 @@
           <w:sz w:val="19"/>
           <w:u w:val="none"/>
         </w:rPr>
-        <w:t>Chef de projet SI avec 3 ans d'expérience en transformation digitale, spécialisé dans le pilotage de projets IA &amp; automatisation. Expérience de bout en bout, du cadrage à la mise en production, en coordination transverse Métiers–IT.</w:t>
+        <w:t>Chef de projet SI, 3 ans d'expérience en transformation digitale (BNP Paribas, La Poste), spécialisé dans le pilotage de bout en bout de projets IA et d'automatisation.</w:t>
       </w:r>
     </w:p>
     <w:p>
@@ -1222,7 +1222,7 @@
           <w:u w:val="none"/>
         </w:rPr>
         <w:tab/>
-        <w:t>Pilotage de bout en bout : cadrage, recueil des besoins, recette, mise en production</w:t>
+        <w:t>Cadrage, recueil des besoins, spécifications, recette, mise en production</w:t>
         <w:br/>
         <w:t>Gouvernance (COPIL / COSUI), gestion des risques – Cycle en V, Agile, hybride</w:t>
       </w:r>

</xml_diff>

<commit_message>
CV général V7 : title Transformation digitale & IA, profil repositionné (grands groupes, transverse)
Co-Authored-By: Claude Opus 5.5 <noreply@anthropic.com>
Claude-Session: https://claude.ai/code/session_01Uwm2tAGtUGTnWWMUSVQkub
</commit_message>
<xml_diff>
--- a/output/CV_NicolasQiGUO_General.docx
+++ b/output/CV_NicolasQiGUO_General.docx
@@ -6,7 +6,7 @@
       <w:pPr>
         <w:keepNext w:val="0"/>
         <w:spacing w:before="0" w:after="0" w:line="240" w:lineRule="auto"/>
-        <w:ind w:left="0" w:right="3375"/>
+        <w:ind w:left="0" w:right="3749"/>
       </w:pPr>
       <w:r>
         <w:drawing>
@@ -57,17 +57,17 @@
           <w:b/>
           <w:i w:val="0"/>
           <w:color w:val="000000"/>
-          <w:sz w:val="21"/>
+          <w:sz w:val="23"/>
           <w:u w:val="none"/>
         </w:rPr>
-        <w:t>CHEF DE PROJET SI | TRANSFORMATION IA &amp; AUTOMATISATION</w:t>
+        <w:t>CHEF DE PROJET SI | TRANSFORMATION DIGITALE &amp; IA</w:t>
       </w:r>
     </w:p>
     <w:p>
       <w:pPr>
         <w:keepNext w:val="0"/>
         <w:spacing w:before="120" w:after="20" w:line="240" w:lineRule="auto"/>
-        <w:ind w:left="0" w:right="3375"/>
+        <w:ind w:left="0" w:right="3749"/>
       </w:pPr>
       <w:r>
         <w:rPr>
@@ -85,7 +85,7 @@
       <w:pPr>
         <w:keepNext w:val="0"/>
         <w:spacing w:before="0" w:after="0" w:line="240" w:lineRule="auto"/>
-        <w:ind w:left="0" w:right="3375"/>
+        <w:ind w:left="0" w:right="3749"/>
       </w:pPr>
       <w:r>
         <w:rPr>
@@ -103,7 +103,7 @@
       <w:pPr>
         <w:keepNext w:val="0"/>
         <w:spacing w:before="0" w:after="0" w:line="240" w:lineRule="auto"/>
-        <w:ind w:left="0" w:right="3375"/>
+        <w:ind w:left="0" w:right="3749"/>
       </w:pPr>
       <w:r>
         <w:rPr>
@@ -121,7 +121,7 @@
       <w:pPr>
         <w:keepNext w:val="0"/>
         <w:spacing w:before="140" w:after="0" w:line="240" w:lineRule="auto"/>
-        <w:ind w:left="0" w:right="3375"/>
+        <w:ind w:left="0" w:right="3749"/>
         <w:jc w:val="both"/>
       </w:pPr>
       <w:r>
@@ -144,7 +144,7 @@
           <w:sz w:val="19"/>
           <w:u w:val="none"/>
         </w:rPr>
-        <w:t>Chef de projet SI, 3 ans d'expérience en transformation digitale (BNP Paribas, La Poste), spécialisé dans le pilotage de bout en bout de projets IA et d'automatisation.</w:t>
+        <w:t>Chef de projet SI avec 3 ans d'expérience en transformation digitale au sein de grands groupes (BNP Paribas, La Poste). Pilotage de projets de bout en bout, coordination transverse Métiers–IT, gouvernance et conduite du changement.</w:t>
       </w:r>
     </w:p>
     <w:p>

</xml_diff>

<commit_message>
CV général V8 : title en 3 segments, profil sans répétition du title
En-tête adaptatif : un title trop long pour tenir à côté de la photo
occupe toute la largeur et la photo démarre à la ligne du nom.

Co-Authored-By: Claude Opus 5.5 <noreply@anthropic.com>
Claude-Session: https://claude.ai/code/session_01Uwm2tAGtUGTnWWMUSVQkub
</commit_message>
<xml_diff>
--- a/output/CV_NicolasQiGUO_General.docx
+++ b/output/CV_NicolasQiGUO_General.docx
@@ -6,7 +6,25 @@
       <w:pPr>
         <w:keepNext w:val="0"/>
         <w:spacing w:before="0" w:after="0" w:line="240" w:lineRule="auto"/>
-        <w:ind w:left="0" w:right="3749"/>
+        <w:ind w:left="0"/>
+      </w:pPr>
+      <w:r>
+        <w:rPr>
+          <w:rFonts w:ascii="Times New Roman" w:hAnsi="Times New Roman" w:eastAsia="Times New Roman"/>
+          <w:b/>
+          <w:i w:val="0"/>
+          <w:color w:val="000000"/>
+          <w:sz w:val="22"/>
+          <w:u w:val="none"/>
+        </w:rPr>
+        <w:t>CHEF DE PROJET SI | TRANSFORMATION DIGITALE | IA &amp; AUTOMATISATION</w:t>
+      </w:r>
+    </w:p>
+    <w:p>
+      <w:pPr>
+        <w:keepNext w:val="0"/>
+        <w:spacing w:before="120" w:after="20" w:line="240" w:lineRule="auto"/>
+        <w:ind w:left="0" w:right="2608"/>
       </w:pPr>
       <w:r>
         <w:drawing>
@@ -16,9 +34,9 @@
               <wp:align>right</wp:align>
             </wp:positionH>
             <wp:positionV relativeFrom="paragraph">
-              <wp:posOffset>36000</wp:posOffset>
+              <wp:posOffset>18000</wp:posOffset>
             </wp:positionV>
-            <wp:extent cx="1584000" cy="1050824"/>
+            <wp:extent cx="1440000" cy="955294"/>
             <wp:effectExtent l="0" t="0" r="0" b="0"/>
             <wp:wrapSquare wrapText="bothSides"/>
             <wp:docPr id="1" name="Picture 1"/>
@@ -41,7 +59,7 @@
                   <pic:spPr>
                     <a:xfrm>
                       <a:off x="0" y="0"/>
-                      <a:ext cx="1584000" cy="1050824"/>
+                      <a:ext cx="1440000" cy="955294"/>
                     </a:xfrm>
                     <a:prstGeom prst="rect"/>
                   </pic:spPr>
@@ -51,24 +69,6 @@
           </wp:anchor>
         </w:drawing>
       </w:r>
-      <w:r>
-        <w:rPr>
-          <w:rFonts w:ascii="Times New Roman" w:hAnsi="Times New Roman" w:eastAsia="Times New Roman"/>
-          <w:b/>
-          <w:i w:val="0"/>
-          <w:color w:val="000000"/>
-          <w:sz w:val="23"/>
-          <w:u w:val="none"/>
-        </w:rPr>
-        <w:t>CHEF DE PROJET SI | TRANSFORMATION DIGITALE &amp; IA</w:t>
-      </w:r>
-    </w:p>
-    <w:p>
-      <w:pPr>
-        <w:keepNext w:val="0"/>
-        <w:spacing w:before="120" w:after="20" w:line="240" w:lineRule="auto"/>
-        <w:ind w:left="0" w:right="3749"/>
-      </w:pPr>
       <w:r>
         <w:rPr>
           <w:rFonts w:ascii="Times New Roman" w:hAnsi="Times New Roman" w:eastAsia="Times New Roman"/>
@@ -85,7 +85,7 @@
       <w:pPr>
         <w:keepNext w:val="0"/>
         <w:spacing w:before="0" w:after="0" w:line="240" w:lineRule="auto"/>
-        <w:ind w:left="0" w:right="3749"/>
+        <w:ind w:left="0" w:right="2608"/>
       </w:pPr>
       <w:r>
         <w:rPr>
@@ -103,7 +103,7 @@
       <w:pPr>
         <w:keepNext w:val="0"/>
         <w:spacing w:before="0" w:after="0" w:line="240" w:lineRule="auto"/>
-        <w:ind w:left="0" w:right="3749"/>
+        <w:ind w:left="0" w:right="2608"/>
       </w:pPr>
       <w:r>
         <w:rPr>
@@ -121,7 +121,7 @@
       <w:pPr>
         <w:keepNext w:val="0"/>
         <w:spacing w:before="140" w:after="0" w:line="240" w:lineRule="auto"/>
-        <w:ind w:left="0" w:right="3749"/>
+        <w:ind w:left="0" w:right="2608"/>
         <w:jc w:val="both"/>
       </w:pPr>
       <w:r>
@@ -144,13 +144,13 @@
           <w:sz w:val="19"/>
           <w:u w:val="none"/>
         </w:rPr>
-        <w:t>Chef de projet SI avec 3 ans d'expérience en transformation digitale au sein de grands groupes (BNP Paribas, La Poste). Pilotage de projets de bout en bout, coordination transverse Métiers–IT, gouvernance et conduite du changement.</w:t>
+        <w:t>3 ans d'expérience au sein de grands groupes (BNP Paribas, La Poste). Pilotage de projets de bout en bout, coordination transverse Métiers–IT, gouvernance et conduite du changement.</w:t>
       </w:r>
     </w:p>
     <w:p>
       <w:pPr>
         <w:keepNext w:val="0"/>
-        <w:spacing w:before="160" w:after="140" w:line="24" w:lineRule="auto"/>
+        <w:spacing w:before="280" w:after="140" w:line="24" w:lineRule="auto"/>
         <w:pBdr>
           <w:bottom w:val="single" w:sz="4" w:space="1" w:color="A6A6A6"/>
         </w:pBdr>

</xml_diff>

<commit_message>
CV général V9 : title et photo portrait côte à côte
Co-Authored-By: Claude Opus 5.5 <noreply@anthropic.com>
Claude-Session: https://claude.ai/code/session_01Uwm2tAGtUGTnWWMUSVQkub
</commit_message>
<xml_diff>
--- a/output/CV_NicolasQiGUO_General.docx
+++ b/output/CV_NicolasQiGUO_General.docx
@@ -6,25 +6,7 @@
       <w:pPr>
         <w:keepNext w:val="0"/>
         <w:spacing w:before="0" w:after="0" w:line="240" w:lineRule="auto"/>
-        <w:ind w:left="0"/>
-      </w:pPr>
-      <w:r>
-        <w:rPr>
-          <w:rFonts w:ascii="Times New Roman" w:hAnsi="Times New Roman" w:eastAsia="Times New Roman"/>
-          <w:b/>
-          <w:i w:val="0"/>
-          <w:color w:val="000000"/>
-          <w:sz w:val="22"/>
-          <w:u w:val="none"/>
-        </w:rPr>
-        <w:t>CHEF DE PROJET SI | TRANSFORMATION DIGITALE | IA &amp; AUTOMATISATION</w:t>
-      </w:r>
-    </w:p>
-    <w:p>
-      <w:pPr>
-        <w:keepNext w:val="0"/>
-        <w:spacing w:before="120" w:after="20" w:line="240" w:lineRule="auto"/>
-        <w:ind w:left="0" w:right="2608"/>
+        <w:ind w:left="0" w:right="2173"/>
       </w:pPr>
       <w:r>
         <w:drawing>
@@ -34,9 +16,9 @@
               <wp:align>right</wp:align>
             </wp:positionH>
             <wp:positionV relativeFrom="paragraph">
-              <wp:posOffset>18000</wp:posOffset>
+              <wp:posOffset>36000</wp:posOffset>
             </wp:positionV>
-            <wp:extent cx="1440000" cy="955294"/>
+            <wp:extent cx="1080000" cy="1245176"/>
             <wp:effectExtent l="0" t="0" r="0" b="0"/>
             <wp:wrapSquare wrapText="bothSides"/>
             <wp:docPr id="1" name="Picture 1"/>
@@ -47,7 +29,7 @@
               <a:graphicData uri="http://schemas.openxmlformats.org/drawingml/2006/picture">
                 <pic:pic>
                   <pic:nvPicPr>
-                    <pic:cNvPr id="0" name="photo.png"/>
+                    <pic:cNvPr id="0" name="photo_portrait.png"/>
                     <pic:cNvPicPr/>
                   </pic:nvPicPr>
                   <pic:blipFill>
@@ -59,7 +41,7 @@
                   <pic:spPr>
                     <a:xfrm>
                       <a:off x="0" y="0"/>
-                      <a:ext cx="1440000" cy="955294"/>
+                      <a:ext cx="1080000" cy="1245176"/>
                     </a:xfrm>
                     <a:prstGeom prst="rect"/>
                   </pic:spPr>
@@ -69,6 +51,24 @@
           </wp:anchor>
         </w:drawing>
       </w:r>
+      <w:r>
+        <w:rPr>
+          <w:rFonts w:ascii="Times New Roman" w:hAnsi="Times New Roman" w:eastAsia="Times New Roman"/>
+          <w:b/>
+          <w:i w:val="0"/>
+          <w:color w:val="000000"/>
+          <w:sz w:val="21"/>
+          <w:u w:val="none"/>
+        </w:rPr>
+        <w:t>CHEF DE PROJET SI | TRANSFORMATION DIGITALE | IA &amp; AUTOMATISATION</w:t>
+      </w:r>
+    </w:p>
+    <w:p>
+      <w:pPr>
+        <w:keepNext w:val="0"/>
+        <w:spacing w:before="120" w:after="20" w:line="240" w:lineRule="auto"/>
+        <w:ind w:left="0" w:right="2173"/>
+      </w:pPr>
       <w:r>
         <w:rPr>
           <w:rFonts w:ascii="Times New Roman" w:hAnsi="Times New Roman" w:eastAsia="Times New Roman"/>
@@ -85,7 +85,7 @@
       <w:pPr>
         <w:keepNext w:val="0"/>
         <w:spacing w:before="0" w:after="0" w:line="240" w:lineRule="auto"/>
-        <w:ind w:left="0" w:right="2608"/>
+        <w:ind w:left="0" w:right="2173"/>
       </w:pPr>
       <w:r>
         <w:rPr>
@@ -103,7 +103,7 @@
       <w:pPr>
         <w:keepNext w:val="0"/>
         <w:spacing w:before="0" w:after="0" w:line="240" w:lineRule="auto"/>
-        <w:ind w:left="0" w:right="2608"/>
+        <w:ind w:left="0" w:right="2173"/>
       </w:pPr>
       <w:r>
         <w:rPr>
@@ -121,7 +121,7 @@
       <w:pPr>
         <w:keepNext w:val="0"/>
         <w:spacing w:before="140" w:after="0" w:line="240" w:lineRule="auto"/>
-        <w:ind w:left="0" w:right="2608"/>
+        <w:ind w:left="0" w:right="2173"/>
         <w:jc w:val="both"/>
       </w:pPr>
       <w:r>
@@ -150,7 +150,7 @@
     <w:p>
       <w:pPr>
         <w:keepNext w:val="0"/>
-        <w:spacing w:before="280" w:after="140" w:line="24" w:lineRule="auto"/>
+        <w:spacing w:before="400" w:after="140" w:line="24" w:lineRule="auto"/>
         <w:pBdr>
           <w:bottom w:val="single" w:sz="4" w:space="1" w:color="A6A6A6"/>
         </w:pBdr>

</xml_diff>

<commit_message>
Photo recadrée sans fond vide à gauche, title 10 pt à côté
Co-Authored-By: Claude Opus 5.5 <noreply@anthropic.com>
Claude-Session: https://claude.ai/code/session_01Uwm2tAGtUGTnWWMUSVQkub
</commit_message>
<xml_diff>
--- a/output/CV_NicolasQiGUO_General.docx
+++ b/output/CV_NicolasQiGUO_General.docx
@@ -6,7 +6,7 @@
       <w:pPr>
         <w:keepNext w:val="0"/>
         <w:spacing w:before="0" w:after="0" w:line="240" w:lineRule="auto"/>
-        <w:ind w:left="0" w:right="2173"/>
+        <w:ind w:left="0" w:right="2555"/>
       </w:pPr>
       <w:r>
         <w:drawing>
@@ -18,7 +18,7 @@
             <wp:positionV relativeFrom="paragraph">
               <wp:posOffset>36000</wp:posOffset>
             </wp:positionV>
-            <wp:extent cx="1080000" cy="1245176"/>
+            <wp:extent cx="1368000" cy="1036209"/>
             <wp:effectExtent l="0" t="0" r="0" b="0"/>
             <wp:wrapSquare wrapText="bothSides"/>
             <wp:docPr id="1" name="Picture 1"/>
@@ -29,7 +29,7 @@
               <a:graphicData uri="http://schemas.openxmlformats.org/drawingml/2006/picture">
                 <pic:pic>
                   <pic:nvPicPr>
-                    <pic:cNvPr id="0" name="photo_portrait.png"/>
+                    <pic:cNvPr id="0" name="photo_header.png"/>
                     <pic:cNvPicPr/>
                   </pic:nvPicPr>
                   <pic:blipFill>
@@ -41,7 +41,7 @@
                   <pic:spPr>
                     <a:xfrm>
                       <a:off x="0" y="0"/>
-                      <a:ext cx="1080000" cy="1245176"/>
+                      <a:ext cx="1368000" cy="1036209"/>
                     </a:xfrm>
                     <a:prstGeom prst="rect"/>
                   </pic:spPr>
@@ -57,7 +57,7 @@
           <w:b/>
           <w:i w:val="0"/>
           <w:color w:val="000000"/>
-          <w:sz w:val="21"/>
+          <w:sz w:val="20"/>
           <w:u w:val="none"/>
         </w:rPr>
         <w:t>CHEF DE PROJET SI | TRANSFORMATION DIGITALE | IA &amp; AUTOMATISATION</w:t>
@@ -67,7 +67,7 @@
       <w:pPr>
         <w:keepNext w:val="0"/>
         <w:spacing w:before="120" w:after="20" w:line="240" w:lineRule="auto"/>
-        <w:ind w:left="0" w:right="2173"/>
+        <w:ind w:left="0" w:right="2555"/>
       </w:pPr>
       <w:r>
         <w:rPr>
@@ -85,7 +85,7 @@
       <w:pPr>
         <w:keepNext w:val="0"/>
         <w:spacing w:before="0" w:after="0" w:line="240" w:lineRule="auto"/>
-        <w:ind w:left="0" w:right="2173"/>
+        <w:ind w:left="0" w:right="2555"/>
       </w:pPr>
       <w:r>
         <w:rPr>
@@ -103,7 +103,7 @@
       <w:pPr>
         <w:keepNext w:val="0"/>
         <w:spacing w:before="0" w:after="0" w:line="240" w:lineRule="auto"/>
-        <w:ind w:left="0" w:right="2173"/>
+        <w:ind w:left="0" w:right="2555"/>
       </w:pPr>
       <w:r>
         <w:rPr>
@@ -121,7 +121,7 @@
       <w:pPr>
         <w:keepNext w:val="0"/>
         <w:spacing w:before="140" w:after="0" w:line="240" w:lineRule="auto"/>
-        <w:ind w:left="0" w:right="2173"/>
+        <w:ind w:left="0" w:right="2555"/>
         <w:jc w:val="both"/>
       </w:pPr>
       <w:r>
@@ -150,7 +150,7 @@
     <w:p>
       <w:pPr>
         <w:keepNext w:val="0"/>
-        <w:spacing w:before="400" w:after="140" w:line="24" w:lineRule="auto"/>
+        <w:spacing w:before="240" w:after="140" w:line="24" w:lineRule="auto"/>
         <w:pBdr>
           <w:bottom w:val="single" w:sz="4" w:space="1" w:color="A6A6A6"/>
         </w:pBdr>

</xml_diff>

<commit_message>
BNP / La Poste : précisions de formulation (conception du dispositif, suivi du déploiement, programme transverse, spécifications techniques)
Co-Authored-By: Claude Opus 5.5 <noreply@anthropic.com>
Claude-Session: https://claude.ai/code/session_01Uwm2tAGtUGTnWWMUSVQkub
</commit_message>
<xml_diff>
--- a/output/CV_NicolasQiGUO_General.docx
+++ b/output/CV_NicolasQiGUO_General.docx
@@ -314,7 +314,7 @@
           <w:sz w:val="19"/>
           <w:u w:val="none"/>
         </w:rPr>
-        <w:t>co-construction d'un dispositif de qualification et de priorisation des use cases (valeur business, ROI, faisabilité technique) ; 20+ use cases identifiés, dont 3 retenus pour un lancement en projet</w:t>
+        <w:t>conception et mise en place d'un dispositif de collecte, de qualification et de priorisation des use cases (valeur business, ROI, faisabilité technique) ; 20+ use cases identifiés, dont 3 retenus pour un lancement en projet</w:t>
       </w:r>
     </w:p>
     <w:p>
@@ -358,7 +358,7 @@
           <w:sz w:val="19"/>
           <w:u w:val="none"/>
         </w:rPr>
-        <w:t>recueil et formalisation des besoins, coordination transverse métiers / IT, conduite de POC, coordination et suivi de l'industrialisation de 3 solutions IA (GenAI, RAG, Copilot), reporting auprès des instances de gouvernance</w:t>
+        <w:t>recueil et formalisation des besoins, coordination transverse métiers / IT, conduite de POC, coordination et suivi du déploiement de 3 solutions IA (GenAI, RAG, Copilot), reporting auprès des instances de gouvernance</w:t>
       </w:r>
     </w:p>
     <w:p>
@@ -402,7 +402,7 @@
           <w:sz w:val="19"/>
           <w:u w:val="none"/>
         </w:rPr>
-        <w:t>dans le cadre du déploiement d'un programme IA à grande échelle (5 000+ collaborateurs) : animation d'un réseau de 70+ ambassadeurs IA, sessions d'onboarding et d'acculturation, événements communautaires</w:t>
+        <w:t>dans le cadre du déploiement d'un programme IA transverse à grande échelle (5 000+ collaborateurs) : animation d'un réseau de 70+ ambassadeurs IA, sessions d'onboarding et d'acculturation, événements communautaires</w:t>
       </w:r>
     </w:p>
     <w:p>
@@ -558,7 +558,7 @@
           <w:sz w:val="19"/>
           <w:u w:val="none"/>
         </w:rPr>
-        <w:t>Recueil et analyse des besoins métiers, rédaction des cahiers des charges et spécifications fonctionnelles</w:t>
+        <w:t>Recueil et analyse des besoins métiers, rédaction des cahiers des charges et spécifications fonctionnelles et techniques</w:t>
       </w:r>
     </w:p>
     <w:p>

</xml_diff>

<commit_message>
BNP / La Poste : lancés en projet, accompagnement du déploiement, Pilotage du RUN, Métiers–IT harmonisé
Co-Authored-By: Claude Opus 5.5 <noreply@anthropic.com>
Claude-Session: https://claude.ai/code/session_01Uwm2tAGtUGTnWWMUSVQkub
</commit_message>
<xml_diff>
--- a/output/CV_NicolasQiGUO_General.docx
+++ b/output/CV_NicolasQiGUO_General.docx
@@ -314,7 +314,7 @@
           <w:sz w:val="19"/>
           <w:u w:val="none"/>
         </w:rPr>
-        <w:t>conception et mise en place d'un dispositif de collecte, de qualification et de priorisation des use cases ; 20+ use cases identifiés, dont 3 retenus pour un lancement en projet</w:t>
+        <w:t>conception et mise en place d'un dispositif de collecte, de qualification et de priorisation des use cases ; 20+ use cases identifiés, dont 3 retenus et lancés en projet</w:t>
       </w:r>
     </w:p>
     <w:p>
@@ -358,7 +358,7 @@
           <w:sz w:val="19"/>
           <w:u w:val="none"/>
         </w:rPr>
-        <w:t>recueil et formalisation des besoins, coordination transverse métiers / IT, conduite de POC, coordination et suivi du déploiement de 3 solutions IA (GenAI, RAG, Copilot), reporting auprès des instances de gouvernance</w:t>
+        <w:t>recueil et formalisation des besoins, coordination transverse Métiers–IT, conduite de POC, accompagnement du déploiement de 3 solutions IA (GenAI, RAG, Copilot) et reporting auprès des instances de gouvernance</w:t>
       </w:r>
     </w:p>
     <w:p>
@@ -591,7 +591,7 @@
           <w:sz w:val="19"/>
           <w:u w:val="none"/>
         </w:rPr>
-        <w:t>Coordination métiers / IT pour la coconception des solutions</w:t>
+        <w:t>Coordination Métiers–IT pour la coconception des solutions</w:t>
       </w:r>
     </w:p>
     <w:p>
@@ -723,7 +723,7 @@
           <w:sz w:val="19"/>
           <w:u w:val="none"/>
         </w:rPr>
-        <w:t>Phase RUN :</w:t>
+        <w:t>Pilotage du RUN :</w:t>
       </w:r>
     </w:p>
     <w:p>

</xml_diff>